<commit_message>
Finalizando atividade 4 - TestFrontSelenium com 3 testes .side
</commit_message>
<xml_diff>
--- a/atividade 4 - Selenium/Modelo_Plano_de_Teste_Funcional.docx
+++ b/atividade 4 - Selenium/Modelo_Plano_de_Teste_Funcional.docx
@@ -1,10 +1,11 @@
 
 <file path=word/document.xml><?xml version="1.0" encoding="utf-8"?>
-<w:document xmlns:wpc="http://schemas.microsoft.com/office/word/2010/wordprocessingCanvas" xmlns:cx="http://schemas.microsoft.com/office/drawing/2014/chartex" xmlns:cx1="http://schemas.microsoft.com/office/drawing/2015/9/8/chartex" xmlns:cx2="http://schemas.microsoft.com/office/drawing/2015/10/21/chartex" xmlns:cx3="http://schemas.microsoft.com/office/drawing/2016/5/9/chartex" xmlns:cx4="http://schemas.microsoft.com/office/drawing/2016/5/10/chartex" xmlns:cx5="http://schemas.microsoft.com/office/drawing/2016/5/11/chartex" xmlns:cx6="http://schemas.microsoft.com/office/drawing/2016/5/12/chartex" xmlns:cx7="http://schemas.microsoft.com/office/drawing/2016/5/13/chartex" xmlns:cx8="http://schemas.microsoft.com/office/drawing/2016/5/14/chartex" xmlns:mc="http://schemas.openxmlformats.org/markup-compatibility/2006" xmlns:aink="http://schemas.microsoft.com/office/drawing/2016/ink" xmlns:am3d="http://schemas.microsoft.com/office/drawing/2017/model3d" xmlns:o="urn:schemas-microsoft-com:office:office" xmlns:oel="http://schemas.microsoft.com/office/2019/extlst" xmlns:r="http://schemas.openxmlformats.org/officeDocument/2006/relationships" xmlns:m="http://schemas.openxmlformats.org/officeDocument/2006/math" xmlns:v="urn:schemas-microsoft-com:vml" xmlns:wp14="http://schemas.microsoft.com/office/word/2010/wordprocessingDrawing" xmlns:wp="http://schemas.openxmlformats.org/drawingml/2006/wordprocessingDrawing" xmlns:w10="urn:schemas-microsoft-com:office:word" xmlns:w="http://schemas.openxmlformats.org/wordprocessingml/2006/main" xmlns:w14="http://schemas.microsoft.com/office/word/2010/wordml" xmlns:w15="http://schemas.microsoft.com/office/word/2012/wordml" xmlns:w16cex="http://schemas.microsoft.com/office/word/2018/wordml/cex" xmlns:w16cid="http://schemas.microsoft.com/office/word/2016/wordml/cid" xmlns:w16="http://schemas.microsoft.com/office/word/2018/wordml" xmlns:w16sdtdh="http://schemas.microsoft.com/office/word/2020/wordml/sdtdatahash" xmlns:w16se="http://schemas.microsoft.com/office/word/2015/wordml/symex" xmlns:wpg="http://schemas.microsoft.com/office/word/2010/wordprocessingGroup" xmlns:wpi="http://schemas.microsoft.com/office/word/2010/wordprocessingInk" xmlns:wne="http://schemas.microsoft.com/office/word/2006/wordml" xmlns:wps="http://schemas.microsoft.com/office/word/2010/wordprocessingShape" mc:Ignorable="w14 w15 w16se w16cid w16 w16cex w16sdtdh wp14">
+<w:document xmlns:wpc="http://schemas.microsoft.com/office/word/2010/wordprocessingCanvas" xmlns:cx="http://schemas.microsoft.com/office/drawing/2014/chartex" xmlns:cx1="http://schemas.microsoft.com/office/drawing/2015/9/8/chartex" xmlns:cx2="http://schemas.microsoft.com/office/drawing/2015/10/21/chartex" xmlns:cx3="http://schemas.microsoft.com/office/drawing/2016/5/9/chartex" xmlns:cx4="http://schemas.microsoft.com/office/drawing/2016/5/10/chartex" xmlns:cx5="http://schemas.microsoft.com/office/drawing/2016/5/11/chartex" xmlns:cx6="http://schemas.microsoft.com/office/drawing/2016/5/12/chartex" xmlns:cx7="http://schemas.microsoft.com/office/drawing/2016/5/13/chartex" xmlns:cx8="http://schemas.microsoft.com/office/drawing/2016/5/14/chartex" xmlns:mc="http://schemas.openxmlformats.org/markup-compatibility/2006" xmlns:aink="http://schemas.microsoft.com/office/drawing/2016/ink" xmlns:am3d="http://schemas.microsoft.com/office/drawing/2017/model3d" xmlns:o="urn:schemas-microsoft-com:office:office" xmlns:oel="http://schemas.microsoft.com/office/2019/extlst" xmlns:r="http://schemas.openxmlformats.org/officeDocument/2006/relationships" xmlns:m="http://schemas.openxmlformats.org/officeDocument/2006/math" xmlns:v="urn:schemas-microsoft-com:vml" xmlns:wp14="http://schemas.microsoft.com/office/word/2010/wordprocessingDrawing" xmlns:wp="http://schemas.openxmlformats.org/drawingml/2006/wordprocessingDrawing" xmlns:w10="urn:schemas-microsoft-com:office:word" xmlns:w="http://schemas.openxmlformats.org/wordprocessingml/2006/main" xmlns:w14="http://schemas.microsoft.com/office/word/2010/wordml" xmlns:w15="http://schemas.microsoft.com/office/word/2012/wordml" xmlns:w16cex="http://schemas.microsoft.com/office/word/2018/wordml/cex" xmlns:w16cid="http://schemas.microsoft.com/office/word/2016/wordml/cid" xmlns:w16="http://schemas.microsoft.com/office/word/2018/wordml" xmlns:w16du="http://schemas.microsoft.com/office/word/2023/wordml/word16du" xmlns:w16sdtdh="http://schemas.microsoft.com/office/word/2020/wordml/sdtdatahash" xmlns:w16sdtfl="http://schemas.microsoft.com/office/word/2024/wordml/sdtformatlock" xmlns:w16se="http://schemas.microsoft.com/office/word/2015/wordml/symex" xmlns:wpg="http://schemas.microsoft.com/office/word/2010/wordprocessingGroup" xmlns:wpi="http://schemas.microsoft.com/office/word/2010/wordprocessingInk" xmlns:wne="http://schemas.microsoft.com/office/word/2006/wordml" xmlns:wps="http://schemas.microsoft.com/office/word/2010/wordprocessingShape" mc:Ignorable="w14 w15 w16se w16cid w16 w16cex w16sdtdh w16sdtfl w16du wp14">
   <w:body>
     <w:p>
       <w:pPr>
         <w:pStyle w:val="Corpodetexto"/>
+        <w:jc w:val="both"/>
         <w:rPr>
           <w:rFonts w:ascii="Times New Roman"/>
           <w:sz w:val="20"/>
@@ -15,7 +16,7 @@
           <w:noProof/>
         </w:rPr>
         <w:pict w14:anchorId="0A4AD06C">
-          <v:shape id="_x0000_s2054" alt="" style="position:absolute;margin-left:-50pt;margin-top:-55pt;width:587.45pt;height:595.3pt;z-index:-251639808;mso-wrap-edited:f;mso-width-percent:0;mso-height-percent:0;mso-width-percent:0;mso-height-percent:0" coordsize="11749,11906" o:spt="100" adj="0,,0" path="m7804,6949l4925,6905,,5438,,6643,4288,8244r2830,-2l7804,6949m9339,r-4,l8480,5679,7804,6949r163,3l9117,4800,9339,t2410,11906l11745,11897r-30,-65l11683,11768r-32,-64l11617,11641r-35,-62l11545,11518r-37,-61l11469,11397r-39,-59l11389,11280r-42,-58l11304,11166r-44,-56l11215,11055r-46,-54l11121,10948r-48,-52l11024,10845r-50,-50l10923,10746r-52,-48l10818,10650r-54,-46l10709,10559r-56,-44l10597,10472r-58,-42l10481,10389r-59,-39l10362,10311r-61,-37l10240,10237r-62,-35l10115,10168r-64,-32l9987,10104r-65,-30l9856,10045r-67,-28l9722,9991r-68,-25l9586,9942r-69,-23l9447,9898r-70,-20l9306,9860r-71,-17l9163,9827r-72,-14l9018,9800r-73,-11l8871,9779r-74,-8l8722,9764r-75,-6l8571,9754r-76,-2l8419,9751r-76,1l8267,9754r-76,4l8116,9764r-75,7l7967,9779r-74,10l7820,9800r-73,13l7674,9827r-71,16l7531,9860r-70,18l7390,9898r-69,21l7252,9942r-69,24l7116,9991r-68,26l6982,10045r-66,29l6851,10104r-64,32l6723,10168r-63,34l6598,10237r-62,37l6476,10311r-60,39l6357,10389r-59,41l6241,10472r-57,43l6129,10559r-55,45l6020,10650r-53,48l5915,10746r-51,49l5814,10845r-49,51l5716,10948r-47,53l5623,11055r-45,55l5534,11166r-43,56l5449,11280r-41,58l5368,11397r-38,60l5292,11518r-36,61l5221,11641r-34,63l5154,11768r-31,64l5093,11897r-4,9l11749,11906e" fillcolor="#121f46" stroked="f">
+          <v:shape id="_x0000_s2054" alt="" style="position:absolute;left:0;text-align:left;margin-left:-50pt;margin-top:-55pt;width:587.45pt;height:595.3pt;z-index:-251639808;mso-wrap-edited:f;mso-width-percent:0;mso-height-percent:0;mso-width-percent:0;mso-height-percent:0" coordsize="11749,11906" o:spt="100" adj="0,,0" path="m7804,6949l4925,6905,,5438,,6643,4288,8244r2830,-2l7804,6949m9339,r-4,l8480,5679,7804,6949r163,3l9117,4800,9339,t2410,11906l11745,11897r-30,-65l11683,11768r-32,-64l11617,11641r-35,-62l11545,11518r-37,-61l11469,11397r-39,-59l11389,11280r-42,-58l11304,11166r-44,-56l11215,11055r-46,-54l11121,10948r-48,-52l11024,10845r-50,-50l10923,10746r-52,-48l10818,10650r-54,-46l10709,10559r-56,-44l10597,10472r-58,-42l10481,10389r-59,-39l10362,10311r-61,-37l10240,10237r-62,-35l10115,10168r-64,-32l9987,10104r-65,-30l9856,10045r-67,-28l9722,9991r-68,-25l9586,9942r-69,-23l9447,9898r-70,-20l9306,9860r-71,-17l9163,9827r-72,-14l9018,9800r-73,-11l8871,9779r-74,-8l8722,9764r-75,-6l8571,9754r-76,-2l8419,9751r-76,1l8267,9754r-76,4l8116,9764r-75,7l7967,9779r-74,10l7820,9800r-73,13l7674,9827r-71,16l7531,9860r-70,18l7390,9898r-69,21l7252,9942r-69,24l7116,9991r-68,26l6982,10045r-66,29l6851,10104r-64,32l6723,10168r-63,34l6598,10237r-62,37l6476,10311r-60,39l6357,10389r-59,41l6241,10472r-57,43l6129,10559r-55,45l6020,10650r-53,48l5915,10746r-51,49l5814,10845r-49,51l5716,10948r-47,53l5623,11055r-45,55l5534,11166r-43,56l5449,11280r-41,58l5368,11397r-38,60l5292,11518r-36,61l5221,11641r-34,63l5154,11768r-31,64l5093,11897r-4,9l11749,11906e" fillcolor="#121f46" stroked="f">
             <v:stroke joinstyle="round"/>
             <v:formulas/>
             <v:path arrowok="t" o:connecttype="custom" o:connectlocs="0,3453130;4519930,5233670;5927725,0;5059045,4414520;7460615,7560310;7418705,7472680;7354570,7352665;7282815,7237095;7205345,7125970;7121525,7019925;7031355,6918960;6936105,6823710;6835140,6733540;6729095,6649720;6617970,6572250;6502400,6500495;6382385,6436360;6258560,6378575;6130290,6328410;5998845,6285230;5864225,6250305;5726430,6223000;5586095,6204585;5442585,6193790;5297805,6192520;5153660,6200140;5012055,6216015;4872990,6240145;4737735,6272530;4605020,6313170;4475480,6360795;4350385,6416040;4229100,6478270;4112260,6547485;3999230,6623050;3891915,6704965;3789045,6793230;3691890,6886575;3599815,6985635;3514090,7090410;3434080,7199630;3360420,7313930;3293745,7432040;3234055,7554595" o:connectangles="0,0,0,0,0,0,0,0,0,0,0,0,0,0,0,0,0,0,0,0,0,0,0,0,0,0,0,0,0,0,0,0,0,0,0,0,0,0,0,0,0,0,0,0"/>
@@ -27,7 +28,7 @@
           <w:noProof/>
         </w:rPr>
         <w:pict w14:anchorId="1E008171">
-          <v:shape id="_x0000_s2053" alt="" style="position:absolute;margin-left:-50pt;margin-top:-55pt;width:449.7pt;height:295.65pt;z-index:-251640832;mso-wrap-edited:f;mso-width-percent:0;mso-height-percent:0;mso-width-percent:0;mso-height-percent:0" coordsize="8994,5914" path="m8994,l7840,4018,6375,5914r-2670,-4l,4783e" filled="f" strokecolor="#121f46" strokeweight="1pt">
+          <v:shape id="_x0000_s2053" alt="" style="position:absolute;left:0;text-align:left;margin-left:-50pt;margin-top:-55pt;width:449.7pt;height:295.65pt;z-index:-251640832;mso-wrap-edited:f;mso-width-percent:0;mso-height-percent:0;mso-width-percent:0;mso-height-percent:0" coordsize="8994,5914" path="m8994,l7840,4018,6375,5914r-2670,-4l,4783e" filled="f" strokecolor="#121f46" strokeweight="1pt">
             <v:path arrowok="t" o:connecttype="custom" o:connectlocs="5711190,0;4978400,2550999;4048125,3754755;2352675,3752215;0,3036691" o:connectangles="0,0,0,0,0"/>
           </v:shape>
         </w:pict>
@@ -37,7 +38,7 @@
           <w:noProof/>
         </w:rPr>
         <w:pict w14:anchorId="3B3DB86C">
-          <v:shape id="_x0000_s2052" alt="" style="position:absolute;margin-left:-50pt;margin-top:-55pt;width:396.8pt;height:205.75pt;z-index:-251641856;mso-wrap-edited:f;mso-width-percent:0;mso-height-percent:0;mso-width-percent:0;mso-height-percent:0" coordsize="7936,4115" path="m7936,l,,,4091r279,24l6124,4115r109,-14l7348,2708,7936,xe" fillcolor="#121f46" stroked="f">
+          <v:shape id="_x0000_s2052" alt="" style="position:absolute;left:0;text-align:left;margin-left:-50pt;margin-top:-55pt;width:396.8pt;height:205.75pt;z-index:-251641856;mso-wrap-edited:f;mso-width-percent:0;mso-height-percent:0;mso-width-percent:0;mso-height-percent:0" coordsize="7936,4115" path="m7936,l,,,4091r279,24l6124,4115r109,-14l7348,2708,7936,xe" fillcolor="#121f46" stroked="f">
             <v:fill opacity="39321f"/>
             <v:path arrowok="t" o:connecttype="custom" o:connectlocs="5039360,0;0,0;0,2597785;177165,2613025;3888740,2613025;3957955,2604135;4665980,1719580;5039360,0" o:connectangles="0,0,0,0,0,0,0,0"/>
           </v:shape>
@@ -47,6 +48,7 @@
     <w:p>
       <w:pPr>
         <w:pStyle w:val="Corpodetexto"/>
+        <w:jc w:val="both"/>
         <w:rPr>
           <w:rFonts w:ascii="Times New Roman"/>
           <w:sz w:val="20"/>
@@ -56,6 +58,7 @@
     <w:p>
       <w:pPr>
         <w:pStyle w:val="Corpodetexto"/>
+        <w:jc w:val="both"/>
         <w:rPr>
           <w:rFonts w:ascii="Times New Roman"/>
           <w:sz w:val="20"/>
@@ -65,6 +68,7 @@
     <w:p>
       <w:pPr>
         <w:pStyle w:val="Corpodetexto"/>
+        <w:jc w:val="both"/>
         <w:rPr>
           <w:rFonts w:ascii="Times New Roman"/>
           <w:sz w:val="20"/>
@@ -74,6 +78,7 @@
     <w:p>
       <w:pPr>
         <w:pStyle w:val="Corpodetexto"/>
+        <w:jc w:val="both"/>
         <w:rPr>
           <w:rFonts w:ascii="Times New Roman"/>
           <w:sz w:val="20"/>
@@ -83,6 +88,7 @@
     <w:p>
       <w:pPr>
         <w:pStyle w:val="Corpodetexto"/>
+        <w:jc w:val="both"/>
         <w:rPr>
           <w:rFonts w:ascii="Times New Roman"/>
           <w:sz w:val="20"/>
@@ -92,6 +98,7 @@
     <w:p>
       <w:pPr>
         <w:pStyle w:val="Corpodetexto"/>
+        <w:jc w:val="both"/>
         <w:rPr>
           <w:rFonts w:ascii="Times New Roman"/>
           <w:sz w:val="20"/>
@@ -101,6 +108,7 @@
     <w:p>
       <w:pPr>
         <w:pStyle w:val="Corpodetexto"/>
+        <w:jc w:val="both"/>
         <w:rPr>
           <w:rFonts w:ascii="Times New Roman"/>
           <w:sz w:val="20"/>
@@ -110,6 +118,7 @@
     <w:p>
       <w:pPr>
         <w:pStyle w:val="Corpodetexto"/>
+        <w:jc w:val="both"/>
         <w:rPr>
           <w:rFonts w:ascii="Times New Roman"/>
           <w:sz w:val="20"/>
@@ -119,6 +128,7 @@
     <w:p>
       <w:pPr>
         <w:pStyle w:val="Corpodetexto"/>
+        <w:jc w:val="both"/>
         <w:rPr>
           <w:rFonts w:ascii="Times New Roman"/>
           <w:sz w:val="20"/>
@@ -128,6 +138,7 @@
     <w:p>
       <w:pPr>
         <w:pStyle w:val="Corpodetexto"/>
+        <w:jc w:val="both"/>
         <w:rPr>
           <w:rFonts w:ascii="Times New Roman"/>
           <w:sz w:val="20"/>
@@ -137,6 +148,7 @@
     <w:p>
       <w:pPr>
         <w:pStyle w:val="Corpodetexto"/>
+        <w:jc w:val="both"/>
         <w:rPr>
           <w:rFonts w:ascii="Times New Roman"/>
           <w:sz w:val="20"/>
@@ -146,6 +158,7 @@
     <w:p>
       <w:pPr>
         <w:pStyle w:val="Corpodetexto"/>
+        <w:jc w:val="both"/>
         <w:rPr>
           <w:rFonts w:ascii="Times New Roman"/>
           <w:sz w:val="20"/>
@@ -155,6 +168,7 @@
     <w:p>
       <w:pPr>
         <w:pStyle w:val="Corpodetexto"/>
+        <w:jc w:val="both"/>
         <w:rPr>
           <w:rFonts w:ascii="Times New Roman"/>
           <w:sz w:val="20"/>
@@ -165,7 +179,7 @@
       <w:pPr>
         <w:spacing w:before="61" w:line="876" w:lineRule="exact"/>
         <w:ind w:right="111"/>
-        <w:jc w:val="right"/>
+        <w:jc w:val="both"/>
         <w:rPr>
           <w:b/>
           <w:color w:val="952E4B"/>
@@ -187,7 +201,7 @@
       <w:pPr>
         <w:spacing w:before="61" w:line="876" w:lineRule="exact"/>
         <w:ind w:right="111"/>
-        <w:jc w:val="right"/>
+        <w:jc w:val="both"/>
         <w:rPr>
           <w:b/>
           <w:color w:val="952E4B"/>
@@ -240,7 +254,7 @@
     <w:p>
       <w:pPr>
         <w:spacing w:line="876" w:lineRule="exact"/>
-        <w:jc w:val="right"/>
+        <w:jc w:val="both"/>
         <w:rPr>
           <w:sz w:val="80"/>
         </w:rPr>
@@ -256,6 +270,7 @@
       <w:pPr>
         <w:pStyle w:val="Corpodetexto"/>
         <w:spacing w:before="9"/>
+        <w:jc w:val="both"/>
         <w:rPr>
           <w:b/>
           <w:sz w:val="11"/>
@@ -290,7 +305,7 @@
         <w:pStyle w:val="Ttulo2"/>
         <w:spacing w:before="292"/>
         <w:ind w:left="0"/>
-        <w:jc w:val="center"/>
+        <w:jc w:val="both"/>
         <w:rPr>
           <w:b/>
           <w:color w:val="C4415A"/>
@@ -318,8 +333,15 @@
         <w:t>para o Sistema Projeto-API</w:t>
       </w:r>
     </w:p>
-    <w:p/>
-    <w:p>
+    <w:p>
+      <w:pPr>
+        <w:jc w:val="both"/>
+      </w:pPr>
+    </w:p>
+    <w:p>
+      <w:pPr>
+        <w:jc w:val="both"/>
+      </w:pPr>
       <w:r>
         <w:rPr>
           <w:b/>
@@ -337,8 +359,15 @@
         <w:t>no sistema Projeto-API.</w:t>
       </w:r>
     </w:p>
-    <w:p/>
-    <w:p>
+    <w:p>
+      <w:pPr>
+        <w:jc w:val="both"/>
+      </w:pPr>
+    </w:p>
+    <w:p>
+      <w:pPr>
+        <w:jc w:val="both"/>
+      </w:pPr>
       <w:r>
         <w:rPr>
           <w:b/>
@@ -364,14 +393,16 @@
     </w:p>
     <w:p>
       <w:pPr>
-        <w:rPr>
-          <w:b/>
-          <w:bCs/>
-        </w:rPr>
-      </w:pPr>
-    </w:p>
-    <w:p>
-      <w:pPr>
+        <w:jc w:val="both"/>
+        <w:rPr>
+          <w:b/>
+          <w:bCs/>
+        </w:rPr>
+      </w:pPr>
+    </w:p>
+    <w:p>
+      <w:pPr>
+        <w:jc w:val="both"/>
         <w:rPr>
           <w:b/>
           <w:bCs/>
@@ -386,13 +417,21 @@
       </w:r>
     </w:p>
     <w:p>
+      <w:pPr>
+        <w:jc w:val="both"/>
+      </w:pPr>
       <w:r>
         <w:t xml:space="preserve">1. Preparação do Ambiente de Teste </w:t>
       </w:r>
     </w:p>
-    <w:p/>
-    <w:p>
-      <w:pPr>
+    <w:p>
+      <w:pPr>
+        <w:jc w:val="both"/>
+      </w:pPr>
+    </w:p>
+    <w:p>
+      <w:pPr>
+        <w:jc w:val="both"/>
         <w:rPr>
           <w:b/>
           <w:bCs/>
@@ -409,10 +448,6 @@
     <w:p>
       <w:pPr>
         <w:pStyle w:val="PargrafodaLista"/>
-        <w:numPr>
-          <w:ilvl w:val="0"/>
-          <w:numId w:val="24"/>
-        </w:numPr>
       </w:pPr>
       <w:r>
         <w:t xml:space="preserve">O Node.js encontrado no link </w:t>
@@ -436,25 +471,10 @@
           <w:ilvl w:val="0"/>
           <w:numId w:val="24"/>
         </w:numPr>
-      </w:pPr>
-      <w:r>
-        <w:t>Os servidores http-</w:t>
-      </w:r>
-      <w:proofErr w:type="gramStart"/>
-      <w:r>
-        <w:t>server</w:t>
-      </w:r>
-      <w:proofErr w:type="gramEnd"/>
-      <w:r>
-        <w:t xml:space="preserve"> e </w:t>
-      </w:r>
-      <w:proofErr w:type="spellStart"/>
-      <w:r>
-        <w:t>json</w:t>
-      </w:r>
-      <w:proofErr w:type="spellEnd"/>
-      <w:r>
-        <w:t>-server devem ser instalados e executando dentro do Node na máquina corretamente;</w:t>
+        <w:jc w:val="both"/>
+      </w:pPr>
+      <w:r>
+        <w:t>Os servidores http-server e json-server devem ser instalados e executando dentro do Node na máquina corretamente;</w:t>
       </w:r>
     </w:p>
     <w:p>
@@ -464,6 +484,7 @@
           <w:ilvl w:val="0"/>
           <w:numId w:val="24"/>
         </w:numPr>
+        <w:jc w:val="both"/>
       </w:pPr>
       <w:r>
         <w:t>O sistema Projeto-API deve estar disponível localmente;</w:t>
@@ -476,48 +497,11 @@
           <w:ilvl w:val="0"/>
           <w:numId w:val="24"/>
         </w:numPr>
-      </w:pPr>
-      <w:r>
-        <w:t xml:space="preserve">Navegador Google Chrome com o </w:t>
-      </w:r>
-      <w:proofErr w:type="spellStart"/>
-      <w:r>
-        <w:t>Pluggin</w:t>
-      </w:r>
-      <w:proofErr w:type="spellEnd"/>
-      <w:r>
-        <w:t xml:space="preserve"> do </w:t>
-      </w:r>
-      <w:proofErr w:type="spellStart"/>
-      <w:r>
-        <w:t>Selenium</w:t>
-      </w:r>
-      <w:proofErr w:type="spellEnd"/>
-      <w:r>
-        <w:t xml:space="preserve"> IDE instalado no navegador.</w:t>
-      </w:r>
-    </w:p>
-    <w:p/>
-    <w:p/>
-    <w:p>
-      <w:r>
-        <w:t>2. Execução dos Casos de Teste</w:t>
-      </w:r>
-    </w:p>
-    <w:p/>
-    <w:p/>
-    <w:p>
-      <w:r>
-        <w:rPr>
-          <w:b/>
-          <w:bCs/>
-        </w:rPr>
-        <w:t xml:space="preserve">Ferramentas de Teste:  </w:t>
-      </w:r>
-      <w:r>
-        <w:t xml:space="preserve"> </w:t>
-      </w:r>
-      <w:proofErr w:type="spellStart"/>
+        <w:jc w:val="both"/>
+      </w:pPr>
+      <w:r>
+        <w:t xml:space="preserve">Navegador </w:t>
+      </w:r>
       <w:r>
         <w:rPr>
           <w:rFonts w:ascii="Myriad Pro Light" w:eastAsia="Myriad Pro Light" w:hAnsi="Myriad Pro Light" w:cs="Myriad Pro Light"/>
@@ -525,9 +509,54 @@
           <w:color w:val="C4415A"/>
           <w:u w:val="single"/>
         </w:rPr>
-        <w:t>Selenium</w:t>
-      </w:r>
-      <w:proofErr w:type="spellEnd"/>
+        <w:t>Mozilla Firefox</w:t>
+      </w:r>
+      <w:r>
+        <w:t xml:space="preserve"> c</w:t>
+      </w:r>
+      <w:r>
+        <w:t>om o Pluggin do Selenium IDE instalado no navegador.</w:t>
+      </w:r>
+    </w:p>
+    <w:p>
+      <w:pPr>
+        <w:jc w:val="both"/>
+      </w:pPr>
+    </w:p>
+    <w:p>
+      <w:pPr>
+        <w:jc w:val="both"/>
+      </w:pPr>
+    </w:p>
+    <w:p>
+      <w:pPr>
+        <w:jc w:val="both"/>
+      </w:pPr>
+      <w:r>
+        <w:t>2. Execução dos Casos de Teste</w:t>
+      </w:r>
+    </w:p>
+    <w:p>
+      <w:pPr>
+        <w:jc w:val="both"/>
+      </w:pPr>
+    </w:p>
+    <w:p>
+      <w:pPr>
+        <w:jc w:val="both"/>
+      </w:pPr>
+    </w:p>
+    <w:p>
+      <w:r>
+        <w:rPr>
+          <w:b/>
+          <w:bCs/>
+        </w:rPr>
+        <w:t xml:space="preserve">Ferramentas de Teste:  </w:t>
+      </w:r>
+      <w:r>
+        <w:t xml:space="preserve"> </w:t>
+      </w:r>
       <w:r>
         <w:rPr>
           <w:rFonts w:ascii="Myriad Pro Light" w:eastAsia="Myriad Pro Light" w:hAnsi="Myriad Pro Light" w:cs="Myriad Pro Light"/>
@@ -535,26 +564,37 @@
           <w:color w:val="C4415A"/>
           <w:u w:val="single"/>
         </w:rPr>
-        <w:t xml:space="preserve"> IDE e Google Chrome</w:t>
-      </w:r>
-      <w:r>
-        <w:rPr>
-          <w:b/>
+        <w:t xml:space="preserve">Selenium IDE e </w:t>
+      </w:r>
+      <w:r>
+        <w:rPr>
+          <w:rFonts w:ascii="Myriad Pro Light" w:eastAsia="Myriad Pro Light" w:hAnsi="Myriad Pro Light" w:cs="Myriad Pro Light"/>
+          <w:b/>
+          <w:color w:val="C4415A"/>
           <w:u w:val="single"/>
         </w:rPr>
+        <w:t>Mozilla Firefox</w:t>
+      </w:r>
+      <w:r>
+        <w:rPr>
+          <w:b/>
+          <w:u w:val="single"/>
+        </w:rPr>
         <w:t>.</w:t>
       </w:r>
     </w:p>
     <w:p>
       <w:pPr>
-        <w:rPr>
-          <w:b/>
-          <w:bCs/>
-        </w:rPr>
-      </w:pPr>
-    </w:p>
-    <w:p>
-      <w:pPr>
+        <w:jc w:val="both"/>
+        <w:rPr>
+          <w:b/>
+          <w:bCs/>
+        </w:rPr>
+      </w:pPr>
+    </w:p>
+    <w:p>
+      <w:pPr>
+        <w:jc w:val="both"/>
         <w:rPr>
           <w:b/>
           <w:bCs/>
@@ -579,6 +619,7 @@
           </w:tcPr>
           <w:p>
             <w:pPr>
+              <w:jc w:val="both"/>
               <w:rPr>
                 <w:b/>
                 <w:bCs/>
@@ -599,14 +640,18 @@
               <w:t xml:space="preserve"> </w:t>
             </w:r>
             <w:r>
-              <w:rPr>
-                <w:highlight w:val="yellow"/>
-              </w:rPr>
-              <w:t>&lt;Digitar nome&gt;</w:t>
+              <w:t>Claudemagno V</w:t>
+            </w:r>
+            <w:r>
+              <w:t>argas</w:t>
+            </w:r>
+            <w:r>
+              <w:t xml:space="preserve"> Gomes</w:t>
             </w:r>
           </w:p>
           <w:p>
             <w:pPr>
+              <w:jc w:val="both"/>
               <w:rPr>
                 <w:b/>
                 <w:bCs/>
@@ -619,6 +664,9 @@
             <w:tcW w:w="2835" w:type="dxa"/>
           </w:tcPr>
           <w:p>
+            <w:pPr>
+              <w:jc w:val="both"/>
+            </w:pPr>
             <w:r>
               <w:rPr>
                 <w:b/>
@@ -626,17 +674,13 @@
               </w:rPr>
               <w:t xml:space="preserve">Data </w:t>
             </w:r>
-            <w:proofErr w:type="spellStart"/>
-            <w:proofErr w:type="gramStart"/>
             <w:r>
               <w:rPr>
                 <w:b/>
                 <w:bCs/>
               </w:rPr>
-              <w:t>inicio</w:t>
+              <w:t>início</w:t>
             </w:r>
-            <w:proofErr w:type="spellEnd"/>
-            <w:proofErr w:type="gramEnd"/>
             <w:r>
               <w:rPr>
                 <w:b/>
@@ -647,28 +691,9 @@
             <w:r>
               <w:t xml:space="preserve">   </w:t>
             </w:r>
-            <w:proofErr w:type="spellStart"/>
             <w:r>
-              <w:rPr>
-                <w:highlight w:val="yellow"/>
-              </w:rPr>
-              <w:t>dd</w:t>
+              <w:t>04/03/2026</w:t>
             </w:r>
-            <w:proofErr w:type="spellEnd"/>
-            <w:r>
-              <w:rPr>
-                <w:highlight w:val="yellow"/>
-              </w:rPr>
-              <w:t>/mm/</w:t>
-            </w:r>
-            <w:proofErr w:type="spellStart"/>
-            <w:r>
-              <w:rPr>
-                <w:highlight w:val="yellow"/>
-              </w:rPr>
-              <w:t>aaaa</w:t>
-            </w:r>
-            <w:proofErr w:type="spellEnd"/>
           </w:p>
         </w:tc>
         <w:tc>
@@ -677,9 +702,11 @@
           </w:tcPr>
           <w:p>
             <w:pPr>
+              <w:jc w:val="both"/>
               <w:rPr>
                 <w:b/>
                 <w:bCs/>
+                <w:u w:val="single"/>
               </w:rPr>
             </w:pPr>
             <w:r>
@@ -696,42 +723,28 @@
               </w:rPr>
               <w:t xml:space="preserve">: </w:t>
             </w:r>
-            <w:proofErr w:type="spellStart"/>
             <w:r>
-              <w:rPr>
-                <w:highlight w:val="yellow"/>
-              </w:rPr>
-              <w:t>dd</w:t>
+              <w:t>10</w:t>
             </w:r>
-            <w:proofErr w:type="spellEnd"/>
             <w:r>
-              <w:rPr>
-                <w:highlight w:val="yellow"/>
-              </w:rPr>
-              <w:t>/mm/</w:t>
+              <w:t>/03/2026</w:t>
             </w:r>
-            <w:proofErr w:type="spellStart"/>
-            <w:r>
-              <w:rPr>
-                <w:highlight w:val="yellow"/>
-              </w:rPr>
-              <w:t>aaaa</w:t>
-            </w:r>
-            <w:proofErr w:type="spellEnd"/>
           </w:p>
         </w:tc>
       </w:tr>
     </w:tbl>
     <w:p>
       <w:pPr>
-        <w:rPr>
-          <w:b/>
-          <w:bCs/>
-        </w:rPr>
-      </w:pPr>
-    </w:p>
-    <w:p>
-      <w:pPr>
+        <w:jc w:val="both"/>
+        <w:rPr>
+          <w:b/>
+          <w:bCs/>
+        </w:rPr>
+      </w:pPr>
+    </w:p>
+    <w:p>
+      <w:pPr>
+        <w:jc w:val="both"/>
         <w:rPr>
           <w:rFonts w:ascii="Myriad Pro Light" w:eastAsia="Myriad Pro Light" w:hAnsi="Myriad Pro Light" w:cs="Myriad Pro Light"/>
           <w:b/>
@@ -743,6 +756,7 @@
     </w:p>
     <w:p>
       <w:pPr>
+        <w:jc w:val="center"/>
         <w:rPr>
           <w:b/>
           <w:bCs/>
@@ -761,15 +775,21 @@
     </w:p>
     <w:p>
       <w:pPr>
-        <w:rPr>
-          <w:b/>
-          <w:bCs/>
-        </w:rPr>
-      </w:pPr>
-    </w:p>
-    <w:p/>
-    <w:p>
-      <w:pPr>
+        <w:jc w:val="both"/>
+        <w:rPr>
+          <w:b/>
+          <w:bCs/>
+        </w:rPr>
+      </w:pPr>
+    </w:p>
+    <w:p>
+      <w:pPr>
+        <w:jc w:val="both"/>
+      </w:pPr>
+    </w:p>
+    <w:p>
+      <w:pPr>
+        <w:jc w:val="both"/>
         <w:rPr>
           <w:b/>
           <w:bCs/>
@@ -785,7 +805,7 @@
     </w:p>
     <w:p>
       <w:pPr>
-        <w:jc w:val="center"/>
+        <w:jc w:val="both"/>
       </w:pPr>
       <w:r>
         <w:t xml:space="preserve">- Teste de Integração </w:t>
@@ -823,7 +843,7 @@
         <w:rPr>
           <w:highlight w:val="yellow"/>
         </w:rPr>
-        <w:t xml:space="preserve">  </w:t>
+        <w:t>X</w:t>
       </w:r>
       <w:r>
         <w:rPr>
@@ -832,8 +852,9 @@
         <w:t>]</w:t>
       </w:r>
       <w:r>
-        <w:t xml:space="preserve"> –  Teste de Unidade </w:t>
-      </w:r>
+        <w:t xml:space="preserve"> – Teste de Unidade </w:t>
+      </w:r>
+      <w:proofErr w:type="gramStart"/>
       <w:r>
         <w:rPr>
           <w:highlight w:val="lightGray"/>
@@ -852,9 +873,11 @@
         </w:rPr>
         <w:t>]</w:t>
       </w:r>
+      <w:proofErr w:type="gramEnd"/>
       <w:r>
         <w:t xml:space="preserve"> - Teste de Sistema </w:t>
       </w:r>
+      <w:proofErr w:type="gramStart"/>
       <w:r>
         <w:rPr>
           <w:highlight w:val="lightGray"/>
@@ -873,9 +896,11 @@
         </w:rPr>
         <w:t>]</w:t>
       </w:r>
+      <w:proofErr w:type="gramEnd"/>
       <w:r>
         <w:t xml:space="preserve"> - Teste de Aceitação </w:t>
       </w:r>
+      <w:proofErr w:type="gramStart"/>
       <w:r>
         <w:rPr>
           <w:highlight w:val="lightGray"/>
@@ -894,17 +919,20 @@
         </w:rPr>
         <w:t>]</w:t>
       </w:r>
-    </w:p>
-    <w:p>
-      <w:pPr>
-        <w:rPr>
-          <w:b/>
-          <w:bCs/>
-        </w:rPr>
-      </w:pPr>
-    </w:p>
-    <w:p>
-      <w:pPr>
+      <w:proofErr w:type="gramEnd"/>
+    </w:p>
+    <w:p>
+      <w:pPr>
+        <w:jc w:val="both"/>
+        <w:rPr>
+          <w:b/>
+          <w:bCs/>
+        </w:rPr>
+      </w:pPr>
+    </w:p>
+    <w:p>
+      <w:pPr>
+        <w:jc w:val="both"/>
         <w:rPr>
           <w:b/>
           <w:bCs/>
@@ -920,6 +948,7 @@
     </w:p>
     <w:p>
       <w:pPr>
+        <w:jc w:val="both"/>
         <w:rPr>
           <w:b/>
           <w:bCs/>
@@ -948,6 +977,7 @@
           </w:tcPr>
           <w:p>
             <w:pPr>
+              <w:jc w:val="both"/>
               <w:rPr>
                 <w:b/>
                 <w:bCs/>
@@ -964,6 +994,7 @@
           </w:tcPr>
           <w:p>
             <w:pPr>
+              <w:jc w:val="both"/>
               <w:rPr>
                 <w:highlight w:val="yellow"/>
               </w:rPr>
@@ -972,21 +1003,13 @@
               <w:rPr>
                 <w:highlight w:val="yellow"/>
               </w:rPr>
-              <w:t xml:space="preserve">&lt;Digitar seu Sistema Operacional ex. Windows 10,11 </w:t>
+              <w:t>Windows 10</w:t>
             </w:r>
-            <w:proofErr w:type="spellStart"/>
             <w:r>
               <w:rPr>
                 <w:highlight w:val="yellow"/>
               </w:rPr>
-              <w:t>etc</w:t>
-            </w:r>
-            <w:proofErr w:type="spellEnd"/>
-            <w:r>
-              <w:rPr>
-                <w:highlight w:val="yellow"/>
-              </w:rPr>
-              <w:t>&gt;</w:t>
+              <w:t xml:space="preserve"> Pró</w:t>
             </w:r>
           </w:p>
         </w:tc>
@@ -1001,6 +1024,9 @@
             <w:tcW w:w="4324" w:type="dxa"/>
           </w:tcPr>
           <w:p>
+            <w:pPr>
+              <w:jc w:val="both"/>
+            </w:pPr>
             <w:r>
               <w:t>Configuração</w:t>
             </w:r>
@@ -1012,15 +1038,41 @@
           </w:tcPr>
           <w:p>
             <w:pPr>
+              <w:jc w:val="both"/>
               <w:rPr>
                 <w:highlight w:val="yellow"/>
+                <w:u w:val="single"/>
               </w:rPr>
             </w:pPr>
             <w:r>
               <w:rPr>
                 <w:highlight w:val="yellow"/>
               </w:rPr>
-              <w:t>&lt;Digitar seu processador, memória, HD&gt;</w:t>
+              <w:t>P</w:t>
+            </w:r>
+            <w:r>
+              <w:rPr>
+                <w:highlight w:val="yellow"/>
+              </w:rPr>
+              <w:t>rocessador</w:t>
+            </w:r>
+            <w:r>
+              <w:rPr>
+                <w:highlight w:val="yellow"/>
+              </w:rPr>
+              <w:t>: I7</w:t>
+            </w:r>
+            <w:r>
+              <w:rPr>
+                <w:highlight w:val="yellow"/>
+              </w:rPr>
+              <w:t>-4770</w:t>
+            </w:r>
+            <w:r>
+              <w:rPr>
+                <w:highlight w:val="yellow"/>
+              </w:rPr>
+              <w:t>, RAM: 16G, armazenamento: 500G</w:t>
             </w:r>
           </w:p>
         </w:tc>
@@ -1036,6 +1088,7 @@
           </w:tcPr>
           <w:p>
             <w:pPr>
+              <w:jc w:val="both"/>
               <w:rPr>
                 <w:b/>
                 <w:bCs/>
@@ -1052,18 +1105,14 @@
           </w:tcPr>
           <w:p>
             <w:pPr>
+              <w:jc w:val="both"/>
               <w:rPr>
                 <w:b/>
                 <w:bCs/>
               </w:rPr>
             </w:pPr>
-            <w:proofErr w:type="spellStart"/>
             <w:r>
-              <w:t>Json</w:t>
-            </w:r>
-            <w:proofErr w:type="spellEnd"/>
-            <w:r>
-              <w:t>-Server</w:t>
+              <w:t>Json-Server</w:t>
             </w:r>
           </w:p>
         </w:tc>
@@ -1079,6 +1128,7 @@
           </w:tcPr>
           <w:p>
             <w:pPr>
+              <w:jc w:val="both"/>
               <w:rPr>
                 <w:b/>
                 <w:bCs/>
@@ -1095,6 +1145,7 @@
           </w:tcPr>
           <w:p>
             <w:pPr>
+              <w:jc w:val="both"/>
               <w:rPr>
                 <w:b/>
                 <w:bCs/>
@@ -1117,6 +1168,7 @@
           </w:tcPr>
           <w:p>
             <w:pPr>
+              <w:jc w:val="both"/>
               <w:rPr>
                 <w:b/>
                 <w:bCs/>
@@ -1132,6 +1184,9 @@
             <w:tcW w:w="8680" w:type="dxa"/>
           </w:tcPr>
           <w:p>
+            <w:pPr>
+              <w:jc w:val="both"/>
+            </w:pPr>
             <w:r>
               <w:t xml:space="preserve">Projeto API - </w:t>
             </w:r>
@@ -1142,11 +1197,24 @@
         </w:tc>
       </w:tr>
     </w:tbl>
-    <w:p/>
-    <w:p/>
-    <w:p/>
-    <w:p>
-      <w:pPr>
+    <w:p>
+      <w:pPr>
+        <w:jc w:val="both"/>
+      </w:pPr>
+    </w:p>
+    <w:p>
+      <w:pPr>
+        <w:jc w:val="both"/>
+      </w:pPr>
+    </w:p>
+    <w:p>
+      <w:pPr>
+        <w:jc w:val="both"/>
+      </w:pPr>
+    </w:p>
+    <w:p>
+      <w:pPr>
+        <w:jc w:val="both"/>
         <w:rPr>
           <w:b/>
           <w:bCs/>
@@ -1161,6 +1229,9 @@
       </w:r>
     </w:p>
     <w:p>
+      <w:pPr>
+        <w:jc w:val="both"/>
+      </w:pPr>
       <w:r>
         <w:t>- Execução de Teste:</w:t>
       </w:r>
@@ -1172,13 +1243,13 @@
         <w:t xml:space="preserve"> </w:t>
       </w:r>
       <w:r>
-        <w:t>Aluno</w:t>
-      </w:r>
-      <w:r>
-        <w:t xml:space="preserve"> Senai</w:t>
-      </w:r>
-    </w:p>
-    <w:p>
+        <w:t>Claudemagno Vargas Gomes</w:t>
+      </w:r>
+    </w:p>
+    <w:p>
+      <w:pPr>
+        <w:jc w:val="both"/>
+      </w:pPr>
       <w:r>
         <w:t xml:space="preserve">- Líder de Teste: </w:t>
       </w:r>
@@ -1186,29 +1257,47 @@
         <w:t xml:space="preserve"> </w:t>
       </w:r>
       <w:r>
-        <w:t>Tutor Senai</w:t>
-      </w:r>
-    </w:p>
-    <w:p>
+        <w:t xml:space="preserve">Tutor </w:t>
+      </w:r>
+      <w:r>
+        <w:t>Lucas Lessa</w:t>
+      </w:r>
+    </w:p>
+    <w:p>
+      <w:pPr>
+        <w:jc w:val="both"/>
+      </w:pPr>
       <w:r>
         <w:t xml:space="preserve">- Engenheiro de Teste 1: </w:t>
       </w:r>
       <w:r>
-        <w:t>Tutor Senai</w:t>
-      </w:r>
-    </w:p>
-    <w:p>
+        <w:t>Aluno Francisco</w:t>
+      </w:r>
+    </w:p>
+    <w:p>
+      <w:pPr>
+        <w:jc w:val="both"/>
+      </w:pPr>
       <w:r>
         <w:t xml:space="preserve">- Engenheiro de Teste 2: </w:t>
       </w:r>
       <w:r>
-        <w:t>Tutor Senai</w:t>
-      </w:r>
-    </w:p>
-    <w:p/>
-    <w:p/>
-    <w:p>
-      <w:pPr>
+        <w:t>professor do vídeo da atividade 4</w:t>
+      </w:r>
+    </w:p>
+    <w:p>
+      <w:pPr>
+        <w:jc w:val="both"/>
+      </w:pPr>
+    </w:p>
+    <w:p>
+      <w:pPr>
+        <w:jc w:val="both"/>
+      </w:pPr>
+    </w:p>
+    <w:p>
+      <w:pPr>
+        <w:jc w:val="both"/>
         <w:rPr>
           <w:b/>
           <w:bCs/>
@@ -1223,21 +1312,50 @@
       </w:r>
     </w:p>
     <w:p>
-      <w:r>
-        <w:t>- Aprovação do Líder de Teste: Tutor SENAI</w:t>
-      </w:r>
-    </w:p>
-    <w:p>
-      <w:r>
-        <w:t>- Aprovação do Gerente de Projeto: Tutor SENAI</w:t>
-      </w:r>
-    </w:p>
-    <w:p/>
-    <w:p/>
-    <w:p/>
-    <w:p/>
-    <w:p>
-      <w:pPr>
+      <w:pPr>
+        <w:jc w:val="both"/>
+      </w:pPr>
+      <w:r>
+        <w:t xml:space="preserve">- Aprovação do Líder de Teste: </w:t>
+      </w:r>
+      <w:r>
+        <w:t>Lucas Lessa</w:t>
+      </w:r>
+    </w:p>
+    <w:p>
+      <w:pPr>
+        <w:jc w:val="both"/>
+      </w:pPr>
+      <w:r>
+        <w:t xml:space="preserve">- Aprovação do Gerente de Projeto: </w:t>
+      </w:r>
+      <w:r>
+        <w:t>Monitora Lorena</w:t>
+      </w:r>
+    </w:p>
+    <w:p>
+      <w:pPr>
+        <w:jc w:val="both"/>
+      </w:pPr>
+    </w:p>
+    <w:p>
+      <w:pPr>
+        <w:jc w:val="both"/>
+      </w:pPr>
+    </w:p>
+    <w:p>
+      <w:pPr>
+        <w:jc w:val="both"/>
+      </w:pPr>
+    </w:p>
+    <w:p>
+      <w:pPr>
+        <w:jc w:val="both"/>
+      </w:pPr>
+    </w:p>
+    <w:p>
+      <w:pPr>
+        <w:jc w:val="both"/>
         <w:rPr>
           <w:rFonts w:ascii="Times New Roman" w:hAnsi="Times New Roman" w:cs="Times New Roman"/>
           <w:sz w:val="24"/>
@@ -1247,6 +1365,7 @@
     </w:p>
     <w:p>
       <w:pPr>
+        <w:jc w:val="center"/>
         <w:rPr>
           <w:rFonts w:ascii="Myriad Pro Light" w:eastAsia="Myriad Pro Light" w:hAnsi="Myriad Pro Light" w:cs="Myriad Pro Light"/>
           <w:b/>
@@ -1265,6 +1384,464 @@
         </w:rPr>
         <w:t>2. Execução dos Casos de Teste</w:t>
       </w:r>
+    </w:p>
+    <w:p>
+      <w:pPr>
+        <w:pStyle w:val="Ttulo2"/>
+        <w:spacing w:before="292"/>
+        <w:ind w:left="0"/>
+        <w:jc w:val="both"/>
+        <w:rPr>
+          <w:b/>
+          <w:color w:val="C4415A"/>
+        </w:rPr>
+      </w:pPr>
+      <w:r>
+        <w:rPr>
+          <w:b/>
+          <w:color w:val="C4415A"/>
+        </w:rPr>
+        <w:t xml:space="preserve">Caso de Teste: </w:t>
+      </w:r>
+      <w:r>
+        <w:rPr>
+          <w:b/>
+          <w:color w:val="C4415A"/>
+        </w:rPr>
+        <w:t>Inserir</w:t>
+      </w:r>
+    </w:p>
+    <w:p>
+      <w:pPr>
+        <w:jc w:val="both"/>
+      </w:pPr>
+    </w:p>
+    <w:p>
+      <w:pPr>
+        <w:jc w:val="both"/>
+      </w:pPr>
+      <w:r>
+        <w:rPr>
+          <w:b/>
+          <w:bCs/>
+        </w:rPr>
+        <w:t>ID do Caso de Teste:</w:t>
+      </w:r>
+      <w:r>
+        <w:t xml:space="preserve"> </w:t>
+      </w:r>
+      <w:r>
+        <w:t>TC-001</w:t>
+      </w:r>
+      <w:r>
+        <w:t xml:space="preserve"> - Inserir</w:t>
+      </w:r>
+    </w:p>
+    <w:p>
+      <w:pPr>
+        <w:jc w:val="both"/>
+      </w:pPr>
+    </w:p>
+    <w:p>
+      <w:pPr>
+        <w:jc w:val="both"/>
+      </w:pPr>
+      <w:r>
+        <w:rPr>
+          <w:b/>
+          <w:bCs/>
+        </w:rPr>
+        <w:t>Propósito:</w:t>
+      </w:r>
+      <w:r>
+        <w:t xml:space="preserve"> </w:t>
+      </w:r>
+      <w:r>
+        <w:t xml:space="preserve">Inserir o cadastro do cliente </w:t>
+      </w:r>
+      <w:r>
+        <w:t xml:space="preserve">6 - </w:t>
+      </w:r>
+      <w:r>
+        <w:rPr>
+          <w:b/>
+          <w:bCs/>
+        </w:rPr>
+        <w:t>Claudemagno V Gomes</w:t>
+      </w:r>
+      <w:r>
+        <w:t xml:space="preserve"> no Projeto-API, executando a partir do servidor local através do Selenium </w:t>
+      </w:r>
+      <w:proofErr w:type="gramStart"/>
+      <w:r>
+        <w:t>IDE.</w:t>
+      </w:r>
+      <w:r>
+        <w:rPr>
+          <w:b/>
+          <w:bCs/>
+        </w:rPr>
+        <w:t>.</w:t>
+      </w:r>
+      <w:proofErr w:type="gramEnd"/>
+    </w:p>
+    <w:p>
+      <w:pPr>
+        <w:jc w:val="both"/>
+      </w:pPr>
+    </w:p>
+    <w:p>
+      <w:pPr>
+        <w:jc w:val="both"/>
+        <w:rPr>
+          <w:b/>
+          <w:bCs/>
+        </w:rPr>
+      </w:pPr>
+      <w:r>
+        <w:rPr>
+          <w:b/>
+          <w:bCs/>
+        </w:rPr>
+        <w:t>Preparação:</w:t>
+      </w:r>
+    </w:p>
+    <w:p>
+      <w:pPr>
+        <w:jc w:val="both"/>
+      </w:pPr>
+      <w:r>
+        <w:t>-</w:t>
+      </w:r>
+      <w:r>
+        <w:t xml:space="preserve"> </w:t>
+      </w:r>
+      <w:r>
+        <w:t xml:space="preserve">No navegador </w:t>
+      </w:r>
+      <w:r>
+        <w:rPr>
+          <w:b/>
+          <w:bCs/>
+        </w:rPr>
+        <w:t>Mozilla Firefox</w:t>
+      </w:r>
+      <w:r>
+        <w:t xml:space="preserve">, abrir a extensão Selenium IDE e acessar o link gerado pelo http-server. Criar o </w:t>
+      </w:r>
+      <w:proofErr w:type="gramStart"/>
+      <w:r>
+        <w:t>arquivo Inserir</w:t>
+      </w:r>
+      <w:proofErr w:type="gramEnd"/>
+      <w:r>
+        <w:t>.side com a gravação do procedimento.</w:t>
+      </w:r>
+    </w:p>
+    <w:p>
+      <w:pPr>
+        <w:jc w:val="both"/>
+      </w:pPr>
+    </w:p>
+    <w:p>
+      <w:pPr>
+        <w:jc w:val="both"/>
+        <w:rPr>
+          <w:b/>
+          <w:bCs/>
+        </w:rPr>
+      </w:pPr>
+      <w:r>
+        <w:rPr>
+          <w:b/>
+          <w:bCs/>
+        </w:rPr>
+        <w:t>Resultado Esperado:</w:t>
+      </w:r>
+    </w:p>
+    <w:p>
+      <w:pPr>
+        <w:jc w:val="both"/>
+      </w:pPr>
+      <w:r>
+        <w:t xml:space="preserve">- </w:t>
+      </w:r>
+      <w:r>
+        <w:t xml:space="preserve">O resultado esperado é que a cada vez que execute o Inserir.side seja gravado um </w:t>
+      </w:r>
+      <w:r>
+        <w:t xml:space="preserve">cadastro com </w:t>
+      </w:r>
+      <w:r>
+        <w:t xml:space="preserve">nome </w:t>
+      </w:r>
+      <w:r>
+        <w:t xml:space="preserve">e endereço </w:t>
+      </w:r>
+      <w:r>
+        <w:t xml:space="preserve">no Projeto-API, criando </w:t>
+      </w:r>
+      <w:r>
+        <w:t xml:space="preserve">o cadastro </w:t>
+      </w:r>
+      <w:r>
+        <w:t>com um novo ID o projeto.</w:t>
+      </w:r>
+    </w:p>
+    <w:p>
+      <w:pPr>
+        <w:jc w:val="both"/>
+      </w:pPr>
+    </w:p>
+    <w:p>
+      <w:pPr>
+        <w:jc w:val="both"/>
+      </w:pPr>
+    </w:p>
+    <w:p>
+      <w:pPr>
+        <w:jc w:val="both"/>
+        <w:rPr>
+          <w:b/>
+          <w:bCs/>
+        </w:rPr>
+      </w:pPr>
+      <w:r>
+        <w:rPr>
+          <w:b/>
+          <w:bCs/>
+        </w:rPr>
+        <w:t>Relatório de Defeitos:</w:t>
+      </w:r>
+    </w:p>
+    <w:p>
+      <w:pPr>
+        <w:jc w:val="both"/>
+        <w:rPr>
+          <w:b/>
+          <w:bCs/>
+        </w:rPr>
+      </w:pPr>
+      <w:r>
+        <w:rPr>
+          <w:b/>
+          <w:bCs/>
+          <w:highlight w:val="yellow"/>
+        </w:rPr>
+        <w:t>Não houve defeitos. O teste foi executado com sucesso e o registro foi salvo corretamente no banco de dados json-server</w:t>
+      </w:r>
+      <w:r>
+        <w:rPr>
+          <w:b/>
+          <w:bCs/>
+        </w:rPr>
+        <w:t xml:space="preserve"> </w:t>
+      </w:r>
+    </w:p>
+    <w:p>
+      <w:pPr>
+        <w:jc w:val="both"/>
+      </w:pPr>
+      <w:r>
+        <w:t xml:space="preserve">Teste Aprovado </w:t>
+      </w:r>
+      <w:r>
+        <w:rPr>
+          <w:highlight w:val="yellow"/>
+        </w:rPr>
+        <w:t>[</w:t>
+      </w:r>
+      <w:r>
+        <w:rPr>
+          <w:highlight w:val="yellow"/>
+        </w:rPr>
+        <w:t>X</w:t>
+      </w:r>
+      <w:proofErr w:type="gramStart"/>
+      <w:r>
+        <w:rPr>
+          <w:highlight w:val="yellow"/>
+        </w:rPr>
+        <w:t>]</w:t>
+      </w:r>
+      <w:r>
+        <w:t xml:space="preserve">  -</w:t>
+      </w:r>
+      <w:proofErr w:type="gramEnd"/>
+      <w:r>
+        <w:t xml:space="preserve"> Teste Reprovado </w:t>
+      </w:r>
+      <w:proofErr w:type="gramStart"/>
+      <w:r>
+        <w:rPr>
+          <w:highlight w:val="yellow"/>
+        </w:rPr>
+        <w:t>[</w:t>
+      </w:r>
+      <w:r>
+        <w:rPr>
+          <w:highlight w:val="yellow"/>
+        </w:rPr>
+        <w:t xml:space="preserve">  </w:t>
+      </w:r>
+      <w:r>
+        <w:rPr>
+          <w:highlight w:val="yellow"/>
+        </w:rPr>
+        <w:t>]</w:t>
+      </w:r>
+      <w:proofErr w:type="gramEnd"/>
+    </w:p>
+    <w:p>
+      <w:pPr>
+        <w:jc w:val="both"/>
+      </w:pPr>
+      <w:r>
+        <w:t xml:space="preserve">Data de Início: </w:t>
+      </w:r>
+      <w:r>
+        <w:rPr>
+          <w:highlight w:val="yellow"/>
+        </w:rPr>
+        <w:t>10</w:t>
+      </w:r>
+      <w:r>
+        <w:rPr>
+          <w:highlight w:val="yellow"/>
+        </w:rPr>
+        <w:t>/03/2026 1</w:t>
+      </w:r>
+      <w:r>
+        <w:rPr>
+          <w:highlight w:val="yellow"/>
+        </w:rPr>
+        <w:t>6</w:t>
+      </w:r>
+      <w:r>
+        <w:rPr>
+          <w:highlight w:val="yellow"/>
+        </w:rPr>
+        <w:t>:30</w:t>
+      </w:r>
+      <w:r>
+        <w:t xml:space="preserve"> </w:t>
+      </w:r>
+      <w:proofErr w:type="gramStart"/>
+      <w:r>
+        <w:t>-  Data</w:t>
+      </w:r>
+      <w:proofErr w:type="gramEnd"/>
+      <w:r>
+        <w:t xml:space="preserve"> de Conclusão: </w:t>
+      </w:r>
+      <w:r>
+        <w:rPr>
+          <w:highlight w:val="yellow"/>
+        </w:rPr>
+        <w:t>10</w:t>
+      </w:r>
+      <w:r>
+        <w:rPr>
+          <w:highlight w:val="yellow"/>
+        </w:rPr>
+        <w:t>/03/2026 1</w:t>
+      </w:r>
+      <w:r>
+        <w:rPr>
+          <w:highlight w:val="yellow"/>
+        </w:rPr>
+        <w:t>6</w:t>
+      </w:r>
+      <w:r>
+        <w:rPr>
+          <w:highlight w:val="yellow"/>
+        </w:rPr>
+        <w:t>:</w:t>
+      </w:r>
+      <w:r>
+        <w:rPr>
+          <w:highlight w:val="yellow"/>
+        </w:rPr>
+        <w:t>0</w:t>
+      </w:r>
+      <w:r>
+        <w:rPr>
+          <w:highlight w:val="yellow"/>
+        </w:rPr>
+        <w:t>5</w:t>
+      </w:r>
+    </w:p>
+    <w:p>
+      <w:pPr>
+        <w:jc w:val="both"/>
+        <w:rPr>
+          <w:b/>
+          <w:color w:val="C4415A"/>
+        </w:rPr>
+      </w:pPr>
+    </w:p>
+    <w:p>
+      <w:pPr>
+        <w:jc w:val="both"/>
+        <w:rPr>
+          <w:b/>
+          <w:color w:val="C4415A"/>
+        </w:rPr>
+      </w:pPr>
+    </w:p>
+    <w:p>
+      <w:pPr>
+        <w:jc w:val="both"/>
+        <w:rPr>
+          <w:b/>
+          <w:color w:val="C4415A"/>
+        </w:rPr>
+      </w:pPr>
+    </w:p>
+    <w:p>
+      <w:pPr>
+        <w:jc w:val="both"/>
+        <w:rPr>
+          <w:b/>
+          <w:color w:val="C4415A"/>
+        </w:rPr>
+      </w:pPr>
+    </w:p>
+    <w:p>
+      <w:pPr>
+        <w:jc w:val="both"/>
+        <w:rPr>
+          <w:b/>
+          <w:color w:val="C4415A"/>
+        </w:rPr>
+      </w:pPr>
+    </w:p>
+    <w:p>
+      <w:pPr>
+        <w:jc w:val="both"/>
+        <w:rPr>
+          <w:b/>
+          <w:color w:val="C4415A"/>
+        </w:rPr>
+      </w:pPr>
+    </w:p>
+    <w:p>
+      <w:pPr>
+        <w:jc w:val="both"/>
+        <w:rPr>
+          <w:b/>
+          <w:color w:val="C4415A"/>
+        </w:rPr>
+      </w:pPr>
+    </w:p>
+    <w:p>
+      <w:pPr>
+        <w:jc w:val="both"/>
+        <w:rPr>
+          <w:b/>
+          <w:color w:val="C4415A"/>
+        </w:rPr>
+      </w:pPr>
     </w:p>
     <w:p>
       <w:pPr>
@@ -1282,6 +1859,7 @@
           <w:b/>
           <w:color w:val="C4415A"/>
         </w:rPr>
+        <w:lastRenderedPageBreak/>
         <w:t xml:space="preserve">Caso de Teste: </w:t>
       </w:r>
       <w:r>
@@ -1289,11 +1867,18 @@
           <w:b/>
           <w:color w:val="C4415A"/>
         </w:rPr>
-        <w:t>Inserir</w:t>
-      </w:r>
-    </w:p>
-    <w:p/>
-    <w:p>
+        <w:t>Excluir</w:t>
+      </w:r>
+    </w:p>
+    <w:p>
+      <w:pPr>
+        <w:jc w:val="both"/>
+      </w:pPr>
+    </w:p>
+    <w:p>
+      <w:pPr>
+        <w:jc w:val="both"/>
+      </w:pPr>
       <w:r>
         <w:rPr>
           <w:b/>
@@ -1305,14 +1890,27 @@
         <w:t xml:space="preserve"> </w:t>
       </w:r>
       <w:r>
-        <w:t>TC-001</w:t>
-      </w:r>
-      <w:r>
-        <w:t xml:space="preserve"> - Inserir</w:t>
-      </w:r>
-    </w:p>
-    <w:p/>
-    <w:p>
+        <w:t>TC-00</w:t>
+      </w:r>
+      <w:r>
+        <w:t>2</w:t>
+      </w:r>
+      <w:r>
+        <w:t xml:space="preserve"> - </w:t>
+      </w:r>
+      <w:r>
+        <w:t>Excluir</w:t>
+      </w:r>
+    </w:p>
+    <w:p>
+      <w:pPr>
+        <w:jc w:val="both"/>
+      </w:pPr>
+    </w:p>
+    <w:p>
+      <w:pPr>
+        <w:jc w:val="both"/>
+      </w:pPr>
       <w:r>
         <w:rPr>
           <w:b/>
@@ -1324,23 +1922,475 @@
         <w:t xml:space="preserve"> </w:t>
       </w:r>
       <w:r>
-        <w:t>Inserir</w:t>
+        <w:t xml:space="preserve">Excluir </w:t>
+      </w:r>
+      <w:r>
+        <w:t>o</w:t>
+      </w:r>
+      <w:r>
+        <w:t xml:space="preserve"> cadastro d</w:t>
+      </w:r>
+      <w:r>
+        <w:t>o</w:t>
+      </w:r>
+      <w:r>
+        <w:t xml:space="preserve"> cliente</w:t>
       </w:r>
       <w:r>
         <w:t xml:space="preserve"> </w:t>
       </w:r>
       <w:r>
-        <w:rPr>
-          <w:b/>
-          <w:bCs/>
-        </w:rPr>
-        <w:t>UM</w:t>
+        <w:t xml:space="preserve">7 - </w:t>
+      </w:r>
+      <w:r>
+        <w:rPr>
+          <w:b/>
+          <w:bCs/>
+        </w:rPr>
+        <w:t>Magno Vargas Gomes</w:t>
+      </w:r>
+      <w:r>
+        <w:t xml:space="preserve"> no Projeto-API executando de servidor </w:t>
+      </w:r>
+      <w:r>
+        <w:rPr>
+          <w:b/>
+          <w:bCs/>
+        </w:rPr>
+        <w:t>local</w:t>
+      </w:r>
+      <w:r>
+        <w:t xml:space="preserve"> através do </w:t>
+      </w:r>
+      <w:r>
+        <w:rPr>
+          <w:b/>
+          <w:bCs/>
+        </w:rPr>
+        <w:t>Selenium IDE.</w:t>
+      </w:r>
+    </w:p>
+    <w:p>
+      <w:pPr>
+        <w:jc w:val="both"/>
+      </w:pPr>
+    </w:p>
+    <w:p>
+      <w:pPr>
+        <w:jc w:val="both"/>
+        <w:rPr>
+          <w:b/>
+          <w:bCs/>
+        </w:rPr>
+      </w:pPr>
+      <w:r>
+        <w:rPr>
+          <w:b/>
+          <w:bCs/>
+        </w:rPr>
+        <w:t>Preparação:</w:t>
+      </w:r>
+    </w:p>
+    <w:p>
+      <w:pPr>
+        <w:jc w:val="both"/>
+      </w:pPr>
+      <w:r>
+        <w:t xml:space="preserve">-No </w:t>
+      </w:r>
+      <w:r>
+        <w:t>Mozilla Firefox</w:t>
+      </w:r>
+      <w:r>
+        <w:t xml:space="preserve"> entrar na extensão Selenium IDE e abrir o link gerado pelo http-server para o Projeto-API. Deverá criar o </w:t>
+      </w:r>
+      <w:proofErr w:type="gramStart"/>
+      <w:r>
+        <w:t>arquivo Excluir</w:t>
+      </w:r>
+      <w:proofErr w:type="gramEnd"/>
+      <w:r>
+        <w:t>.side com a gravação do procedimento de Exclusão do Projeto-API. Após gerar este arquivo testar pelo menos duas vezes e observar o comportamento funcional do sistema</w:t>
+      </w:r>
+      <w:r>
+        <w:t xml:space="preserve"> através do teste automático.</w:t>
+      </w:r>
+    </w:p>
+    <w:p>
+      <w:pPr>
+        <w:jc w:val="both"/>
+      </w:pPr>
+    </w:p>
+    <w:p>
+      <w:pPr>
+        <w:jc w:val="both"/>
+        <w:rPr>
+          <w:b/>
+          <w:bCs/>
+        </w:rPr>
+      </w:pPr>
+      <w:r>
+        <w:rPr>
+          <w:b/>
+          <w:bCs/>
+        </w:rPr>
+        <w:t>Resultado Esperado:</w:t>
+      </w:r>
+    </w:p>
+    <w:p>
+      <w:pPr>
+        <w:jc w:val="both"/>
+      </w:pPr>
+      <w:r>
+        <w:t>- O resultado esperado é que a cada vez que execute o Excluir.side seja retirado um cadastro do Projeto-API.</w:t>
+      </w:r>
+    </w:p>
+    <w:p>
+      <w:pPr>
+        <w:jc w:val="both"/>
+      </w:pPr>
+    </w:p>
+    <w:p>
+      <w:pPr>
+        <w:jc w:val="both"/>
+      </w:pPr>
+    </w:p>
+    <w:p>
+      <w:pPr>
+        <w:jc w:val="both"/>
+        <w:rPr>
+          <w:b/>
+          <w:bCs/>
+        </w:rPr>
+      </w:pPr>
+      <w:r>
+        <w:rPr>
+          <w:b/>
+          <w:bCs/>
+        </w:rPr>
+        <w:t>Relatório de Defeitos:</w:t>
+      </w:r>
+    </w:p>
+    <w:p>
+      <w:pPr>
+        <w:jc w:val="both"/>
+        <w:rPr>
+          <w:b/>
+          <w:color w:val="C4415A"/>
+          <w:u w:val="single"/>
+        </w:rPr>
+      </w:pPr>
+      <w:r>
+        <w:rPr>
+          <w:b/>
+          <w:bCs/>
+          <w:highlight w:val="yellow"/>
+        </w:rPr>
+        <w:t xml:space="preserve">Sem erros. A exclusão foi realizada com sucesso, e o registro foi removido do </w:t>
+      </w:r>
+      <w:proofErr w:type="gramStart"/>
+      <w:r>
+        <w:rPr>
+          <w:b/>
+          <w:bCs/>
+          <w:highlight w:val="yellow"/>
+        </w:rPr>
+        <w:t>db.json</w:t>
+      </w:r>
+      <w:proofErr w:type="gramEnd"/>
+      <w:r>
+        <w:rPr>
+          <w:b/>
+          <w:bCs/>
+          <w:highlight w:val="yellow"/>
+        </w:rPr>
+        <w:t xml:space="preserve"> e da interface após o comando do Selenium.</w:t>
+      </w:r>
+    </w:p>
+    <w:p>
+      <w:pPr>
+        <w:jc w:val="both"/>
+      </w:pPr>
+      <w:r>
+        <w:t xml:space="preserve">Teste Aprovado </w:t>
+      </w:r>
+      <w:r>
+        <w:rPr>
+          <w:highlight w:val="yellow"/>
+        </w:rPr>
+        <w:t>[</w:t>
+      </w:r>
+      <w:r>
+        <w:rPr>
+          <w:highlight w:val="yellow"/>
+        </w:rPr>
+        <w:t>X</w:t>
+      </w:r>
+      <w:r>
+        <w:rPr>
+          <w:highlight w:val="yellow"/>
+        </w:rPr>
+        <w:t>]</w:t>
+      </w:r>
+      <w:r>
+        <w:t xml:space="preserve"> - Teste Reprovado </w:t>
+      </w:r>
+      <w:proofErr w:type="gramStart"/>
+      <w:r>
+        <w:rPr>
+          <w:highlight w:val="yellow"/>
+        </w:rPr>
+        <w:t>[</w:t>
+      </w:r>
+      <w:r>
+        <w:rPr>
+          <w:highlight w:val="yellow"/>
+        </w:rPr>
+        <w:t xml:space="preserve">  </w:t>
+      </w:r>
+      <w:r>
+        <w:rPr>
+          <w:highlight w:val="yellow"/>
+        </w:rPr>
+        <w:t>]</w:t>
+      </w:r>
+      <w:proofErr w:type="gramEnd"/>
+    </w:p>
+    <w:p>
+      <w:pPr>
+        <w:jc w:val="both"/>
+        <w:rPr>
+          <w:b/>
+          <w:color w:val="C4415A"/>
+        </w:rPr>
+      </w:pPr>
+      <w:r>
+        <w:t xml:space="preserve">Data de Início: </w:t>
+      </w:r>
+      <w:r>
+        <w:rPr>
+          <w:highlight w:val="yellow"/>
+        </w:rPr>
+        <w:t>06/03/2026 1</w:t>
+      </w:r>
+      <w:r>
+        <w:rPr>
+          <w:highlight w:val="yellow"/>
+        </w:rPr>
+        <w:t>6</w:t>
+      </w:r>
+      <w:r>
+        <w:rPr>
+          <w:highlight w:val="yellow"/>
+        </w:rPr>
+        <w:t>:45</w:t>
+      </w:r>
+      <w:r>
+        <w:t xml:space="preserve">- Data de Conclusão: </w:t>
+      </w:r>
+      <w:r>
+        <w:rPr>
+          <w:highlight w:val="yellow"/>
+        </w:rPr>
+        <w:t>06/03/2026 19:50</w:t>
+      </w:r>
+    </w:p>
+    <w:p>
+      <w:pPr>
+        <w:jc w:val="both"/>
+        <w:rPr>
+          <w:b/>
+          <w:color w:val="C4415A"/>
+          <w:u w:val="single"/>
+        </w:rPr>
+      </w:pPr>
+    </w:p>
+    <w:p>
+      <w:pPr>
+        <w:jc w:val="both"/>
+        <w:rPr>
+          <w:b/>
+          <w:color w:val="C4415A"/>
+        </w:rPr>
+      </w:pPr>
+    </w:p>
+    <w:p>
+      <w:pPr>
+        <w:jc w:val="both"/>
+        <w:rPr>
+          <w:b/>
+          <w:color w:val="C4415A"/>
+        </w:rPr>
+      </w:pPr>
+    </w:p>
+    <w:p>
+      <w:pPr>
+        <w:jc w:val="both"/>
+        <w:rPr>
+          <w:b/>
+          <w:color w:val="C4415A"/>
+        </w:rPr>
+      </w:pPr>
+    </w:p>
+    <w:p>
+      <w:pPr>
+        <w:jc w:val="both"/>
+        <w:rPr>
+          <w:b/>
+          <w:color w:val="C4415A"/>
+        </w:rPr>
+      </w:pPr>
+    </w:p>
+    <w:p>
+      <w:pPr>
+        <w:jc w:val="both"/>
+        <w:rPr>
+          <w:b/>
+          <w:color w:val="C4415A"/>
+        </w:rPr>
+      </w:pPr>
+    </w:p>
+    <w:p>
+      <w:pPr>
+        <w:jc w:val="both"/>
+        <w:rPr>
+          <w:b/>
+          <w:color w:val="C4415A"/>
+        </w:rPr>
+      </w:pPr>
+    </w:p>
+    <w:p>
+      <w:pPr>
+        <w:jc w:val="both"/>
+        <w:rPr>
+          <w:b/>
+          <w:color w:val="C4415A"/>
+        </w:rPr>
+      </w:pPr>
+    </w:p>
+    <w:p>
+      <w:pPr>
+        <w:jc w:val="both"/>
+        <w:rPr>
+          <w:b/>
+          <w:color w:val="C4415A"/>
+        </w:rPr>
+      </w:pPr>
+    </w:p>
+    <w:p>
+      <w:pPr>
+        <w:jc w:val="both"/>
+        <w:rPr>
+          <w:b/>
+          <w:color w:val="C4415A"/>
+        </w:rPr>
+      </w:pPr>
+    </w:p>
+    <w:p>
+      <w:pPr>
+        <w:jc w:val="both"/>
+        <w:rPr>
+          <w:b/>
+          <w:color w:val="C4415A"/>
+        </w:rPr>
+      </w:pPr>
+    </w:p>
+    <w:p>
+      <w:pPr>
+        <w:pStyle w:val="Ttulo2"/>
+        <w:spacing w:before="292"/>
+        <w:ind w:left="0"/>
+        <w:jc w:val="center"/>
+        <w:rPr>
+          <w:b/>
+          <w:color w:val="C4415A"/>
+        </w:rPr>
+      </w:pPr>
+      <w:r>
+        <w:rPr>
+          <w:b/>
+          <w:color w:val="C4415A"/>
+        </w:rPr>
+        <w:lastRenderedPageBreak/>
+        <w:t xml:space="preserve">Caso de Teste: </w:t>
+      </w:r>
+      <w:r>
+        <w:rPr>
+          <w:b/>
+          <w:color w:val="C4415A"/>
+        </w:rPr>
+        <w:t>Editar</w:t>
+      </w:r>
+    </w:p>
+    <w:p>
+      <w:pPr>
+        <w:jc w:val="both"/>
+      </w:pPr>
+    </w:p>
+    <w:p>
+      <w:pPr>
+        <w:jc w:val="both"/>
+      </w:pPr>
+      <w:r>
+        <w:rPr>
+          <w:b/>
+          <w:bCs/>
+        </w:rPr>
+        <w:t>ID do Caso de Teste:</w:t>
       </w:r>
       <w:r>
         <w:t xml:space="preserve"> </w:t>
       </w:r>
       <w:r>
-        <w:t xml:space="preserve">cadastro de cliente com </w:t>
+        <w:t>TC-00</w:t>
+      </w:r>
+      <w:r>
+        <w:t>3</w:t>
+      </w:r>
+      <w:r>
+        <w:t xml:space="preserve"> - </w:t>
+      </w:r>
+      <w:r>
+        <w:t>Editar</w:t>
+      </w:r>
+    </w:p>
+    <w:p>
+      <w:pPr>
+        <w:jc w:val="both"/>
+      </w:pPr>
+    </w:p>
+    <w:p>
+      <w:pPr>
+        <w:jc w:val="both"/>
+      </w:pPr>
+      <w:r>
+        <w:rPr>
+          <w:b/>
+          <w:bCs/>
+        </w:rPr>
+        <w:t>Propósito:</w:t>
+      </w:r>
+      <w:r>
+        <w:t xml:space="preserve"> </w:t>
+      </w:r>
+      <w:r>
+        <w:t>Editar</w:t>
+      </w:r>
+      <w:r>
+        <w:t xml:space="preserve"> </w:t>
+      </w:r>
+      <w:r>
+        <w:rPr>
+          <w:b/>
+          <w:bCs/>
+        </w:rPr>
+        <w:t xml:space="preserve">O </w:t>
+      </w:r>
+      <w:r>
+        <w:t xml:space="preserve">cadastro de cliente </w:t>
+      </w:r>
+      <w:r>
+        <w:t xml:space="preserve">com o </w:t>
       </w:r>
       <w:r>
         <w:rPr>
@@ -1350,25 +2400,18 @@
         <w:t>nome</w:t>
       </w:r>
       <w:r>
-        <w:t xml:space="preserve"> e </w:t>
-      </w:r>
-      <w:r>
-        <w:rPr>
-          <w:b/>
-          <w:bCs/>
-        </w:rPr>
-        <w:t>endereço</w:t>
-      </w:r>
-      <w:r>
-        <w:t xml:space="preserve"> no Projeto-API executando de </w:t>
-      </w:r>
-      <w:r>
-        <w:t>servidor</w:t>
-      </w:r>
-      <w:r>
         <w:t xml:space="preserve"> </w:t>
       </w:r>
       <w:r>
+        <w:t>João por Prof. Lucas Lessa</w:t>
+      </w:r>
+      <w:r>
+        <w:t xml:space="preserve"> </w:t>
+      </w:r>
+      <w:r>
+        <w:t xml:space="preserve">no Projeto-API executando de servidor </w:t>
+      </w:r>
+      <w:r>
         <w:rPr>
           <w:b/>
           <w:bCs/>
@@ -1378,26 +2421,22 @@
       <w:r>
         <w:t xml:space="preserve"> através do </w:t>
       </w:r>
-      <w:proofErr w:type="spellStart"/>
-      <w:r>
-        <w:rPr>
-          <w:b/>
-          <w:bCs/>
-        </w:rPr>
-        <w:t>Selenium</w:t>
-      </w:r>
-      <w:proofErr w:type="spellEnd"/>
-      <w:r>
-        <w:rPr>
-          <w:b/>
-          <w:bCs/>
-        </w:rPr>
-        <w:t xml:space="preserve"> IDE.</w:t>
-      </w:r>
-    </w:p>
-    <w:p/>
-    <w:p>
-      <w:pPr>
+      <w:r>
+        <w:rPr>
+          <w:b/>
+          <w:bCs/>
+        </w:rPr>
+        <w:t>Selenium IDE.</w:t>
+      </w:r>
+    </w:p>
+    <w:p>
+      <w:pPr>
+        <w:jc w:val="both"/>
+      </w:pPr>
+    </w:p>
+    <w:p>
+      <w:pPr>
+        <w:jc w:val="both"/>
         <w:rPr>
           <w:b/>
           <w:bCs/>
@@ -1412,57 +2451,48 @@
       </w:r>
     </w:p>
     <w:p>
-      <w:r>
-        <w:t>-</w:t>
-      </w:r>
-      <w:r>
-        <w:t xml:space="preserve">No Google Chrome entrar na extensão </w:t>
-      </w:r>
-      <w:proofErr w:type="spellStart"/>
-      <w:r>
-        <w:t>Selenium</w:t>
-      </w:r>
-      <w:proofErr w:type="spellEnd"/>
-      <w:r>
-        <w:t xml:space="preserve"> IDE </w:t>
-      </w:r>
-      <w:r>
-        <w:t>e abrir o link gerado pelo http-</w:t>
-      </w:r>
-      <w:proofErr w:type="gramStart"/>
-      <w:r>
-        <w:t>server</w:t>
-      </w:r>
-      <w:proofErr w:type="gramEnd"/>
-      <w:r>
-        <w:t xml:space="preserve"> para o Projeto-API. Deverá criar o </w:t>
-      </w:r>
-      <w:proofErr w:type="gramStart"/>
-      <w:r>
-        <w:t xml:space="preserve">arquivo </w:t>
-      </w:r>
-      <w:proofErr w:type="spellStart"/>
-      <w:r>
-        <w:t>Inserir</w:t>
-      </w:r>
-      <w:proofErr w:type="gramEnd"/>
-      <w:r>
-        <w:t>.side</w:t>
-      </w:r>
-      <w:proofErr w:type="spellEnd"/>
-      <w:r>
-        <w:t xml:space="preserve"> com a gravação do procedimento de Inserir do Projeto-API.</w:t>
-      </w:r>
-      <w:r>
-        <w:t xml:space="preserve"> Após gerar este arquivo testar pelo menos três vezes e observar o comportamento funcional do sistema</w:t>
-      </w:r>
-      <w:r>
-        <w:t xml:space="preserve"> através do teste automático.</w:t>
-      </w:r>
-    </w:p>
-    <w:p/>
-    <w:p>
-      <w:pPr>
+      <w:pPr>
+        <w:jc w:val="both"/>
+      </w:pPr>
+      <w:r>
+        <w:t xml:space="preserve">-No </w:t>
+      </w:r>
+      <w:r>
+        <w:t>Mozilla Firefox</w:t>
+      </w:r>
+      <w:r>
+        <w:t xml:space="preserve"> </w:t>
+      </w:r>
+      <w:r>
+        <w:t xml:space="preserve">entrar na extensão Selenium IDE e abrir o link gerado pelo http-server para o Projeto-API. Deverá criar o arquivo </w:t>
+      </w:r>
+      <w:r>
+        <w:t>Editar</w:t>
+      </w:r>
+      <w:r>
+        <w:t xml:space="preserve">.side com a gravação do procedimento de </w:t>
+      </w:r>
+      <w:r>
+        <w:t>edição</w:t>
+      </w:r>
+      <w:r>
+        <w:t xml:space="preserve"> do Projeto-API. Após gerar este arquivo testar pelo menos </w:t>
+      </w:r>
+      <w:r>
+        <w:t>uma vez</w:t>
+      </w:r>
+      <w:r>
+        <w:t xml:space="preserve"> e observar o comportamento funcional do sistema através do teste automático.</w:t>
+      </w:r>
+    </w:p>
+    <w:p>
+      <w:pPr>
+        <w:jc w:val="both"/>
+      </w:pPr>
+    </w:p>
+    <w:p>
+      <w:pPr>
+        <w:jc w:val="both"/>
         <w:rPr>
           <w:b/>
           <w:bCs/>
@@ -1477,43 +2507,38 @@
       </w:r>
     </w:p>
     <w:p>
-      <w:r>
-        <w:t xml:space="preserve">- </w:t>
-      </w:r>
-      <w:r>
-        <w:t xml:space="preserve">O resultado esperado é que a cada vez que execute o </w:t>
-      </w:r>
-      <w:proofErr w:type="spellStart"/>
-      <w:r>
-        <w:t>Inserir.side</w:t>
-      </w:r>
-      <w:proofErr w:type="spellEnd"/>
-      <w:r>
-        <w:t xml:space="preserve"> seja gravado um </w:t>
-      </w:r>
-      <w:r>
-        <w:t xml:space="preserve">cadastro com </w:t>
-      </w:r>
-      <w:r>
-        <w:t xml:space="preserve">nome </w:t>
-      </w:r>
-      <w:r>
-        <w:t xml:space="preserve">e endereço </w:t>
-      </w:r>
-      <w:r>
-        <w:t xml:space="preserve">no Projeto-API, criando </w:t>
-      </w:r>
-      <w:r>
-        <w:t xml:space="preserve">o cadastro </w:t>
-      </w:r>
-      <w:r>
-        <w:t>com um novo ID o projeto.</w:t>
-      </w:r>
-    </w:p>
-    <w:p/>
-    <w:p/>
-    <w:p>
-      <w:pPr>
+      <w:pPr>
+        <w:jc w:val="both"/>
+      </w:pPr>
+      <w:r>
+        <w:t xml:space="preserve">- O resultado esperado é que a cada vez que execute o </w:t>
+      </w:r>
+      <w:r>
+        <w:t>Editar</w:t>
+      </w:r>
+      <w:r>
+        <w:t xml:space="preserve">.side seja </w:t>
+      </w:r>
+      <w:r>
+        <w:t xml:space="preserve">editar um </w:t>
+      </w:r>
+      <w:r>
+        <w:t>cadastro do Projeto-API.</w:t>
+      </w:r>
+    </w:p>
+    <w:p>
+      <w:pPr>
+        <w:jc w:val="both"/>
+      </w:pPr>
+    </w:p>
+    <w:p>
+      <w:pPr>
+        <w:jc w:val="both"/>
+      </w:pPr>
+    </w:p>
+    <w:p>
+      <w:pPr>
+        <w:jc w:val="both"/>
         <w:rPr>
           <w:b/>
           <w:bCs/>
@@ -1526,6 +2551,15 @@
         </w:rPr>
         <w:t>Relatório de Defeitos:</w:t>
       </w:r>
+    </w:p>
+    <w:p>
+      <w:pPr>
+        <w:jc w:val="both"/>
+        <w:rPr>
+          <w:b/>
+          <w:bCs/>
+        </w:rPr>
+      </w:pPr>
     </w:p>
     <w:p>
       <w:pPr>
@@ -1537,6 +2571,7 @@
           <w:between w:val="single" w:sz="4" w:space="1" w:color="auto"/>
           <w:bar w:val="single" w:sz="4" w:color="auto"/>
         </w:pBdr>
+        <w:jc w:val="both"/>
         <w:rPr>
           <w:b/>
           <w:bCs/>
@@ -1548,7 +2583,7 @@
           <w:bCs/>
           <w:highlight w:val="yellow"/>
         </w:rPr>
-        <w:t xml:space="preserve">&lt;Caso </w:t>
+        <w:t>&lt;</w:t>
       </w:r>
       <w:r>
         <w:rPr>
@@ -1556,7 +2591,7 @@
           <w:bCs/>
           <w:highlight w:val="yellow"/>
         </w:rPr>
-        <w:t xml:space="preserve">tenha um erro </w:t>
+        <w:t>Não houve caso de erro após assistir diversas vezes os vídeos disponíveis para só então executar o projeto</w:t>
       </w:r>
       <w:r>
         <w:rPr>
@@ -1564,1242 +2599,188 @@
           <w:bCs/>
           <w:highlight w:val="yellow"/>
         </w:rPr>
-        <w:t>fornecer data, hora</w:t>
-      </w:r>
-      <w:r>
-        <w:rPr>
-          <w:b/>
-          <w:bCs/>
+        <w:t xml:space="preserve"> &gt;</w:t>
+      </w:r>
+    </w:p>
+    <w:p>
+      <w:pPr>
+        <w:jc w:val="both"/>
+        <w:rPr>
+          <w:b/>
+          <w:bCs/>
+        </w:rPr>
+      </w:pPr>
+    </w:p>
+    <w:p>
+      <w:pPr>
+        <w:jc w:val="both"/>
+        <w:rPr>
+          <w:b/>
+          <w:bCs/>
+        </w:rPr>
+      </w:pPr>
+    </w:p>
+    <w:p>
+      <w:pPr>
+        <w:jc w:val="both"/>
+      </w:pPr>
+      <w:r>
+        <w:t xml:space="preserve">Teste Aprovado </w:t>
+      </w:r>
+      <w:proofErr w:type="gramStart"/>
+      <w:r>
+        <w:rPr>
           <w:highlight w:val="yellow"/>
         </w:rPr>
-        <w:t xml:space="preserve"> e descrição do erro</w:t>
-      </w:r>
-      <w:r>
-        <w:rPr>
-          <w:b/>
-          <w:bCs/>
+        <w:t>[</w:t>
+      </w:r>
+      <w:r>
+        <w:rPr>
           <w:highlight w:val="yellow"/>
         </w:rPr>
         <w:t xml:space="preserve"> </w:t>
       </w:r>
       <w:r>
         <w:rPr>
-          <w:b/>
-          <w:bCs/>
           <w:highlight w:val="yellow"/>
         </w:rPr>
-        <w:t>&gt;</w:t>
-      </w:r>
-    </w:p>
-    <w:p>
-      <w:pPr>
+        <w:t>X</w:t>
+      </w:r>
+      <w:proofErr w:type="gramEnd"/>
+      <w:r>
+        <w:rPr>
+          <w:highlight w:val="yellow"/>
+        </w:rPr>
+        <w:t>]</w:t>
+      </w:r>
+      <w:r>
+        <w:t xml:space="preserve"> - Teste Reprovado </w:t>
+      </w:r>
+      <w:proofErr w:type="gramStart"/>
+      <w:r>
+        <w:rPr>
+          <w:highlight w:val="yellow"/>
+        </w:rPr>
+        <w:t>[</w:t>
+      </w:r>
+      <w:r>
+        <w:rPr>
+          <w:highlight w:val="yellow"/>
+        </w:rPr>
+        <w:t xml:space="preserve">  </w:t>
+      </w:r>
+      <w:r>
+        <w:rPr>
+          <w:highlight w:val="yellow"/>
+        </w:rPr>
+        <w:t>]</w:t>
+      </w:r>
+      <w:proofErr w:type="gramEnd"/>
+    </w:p>
+    <w:p>
+      <w:pPr>
+        <w:jc w:val="both"/>
         <w:rPr>
           <w:b/>
           <w:color w:val="C4415A"/>
         </w:rPr>
       </w:pPr>
-    </w:p>
-    <w:p>
-      <w:pPr>
-        <w:rPr>
-          <w:b/>
-          <w:color w:val="C4415A"/>
-        </w:rPr>
-      </w:pPr>
-    </w:p>
-    <w:p>
-      <w:pPr>
-        <w:jc w:val="right"/>
-      </w:pPr>
-      <w:r>
-        <w:t xml:space="preserve">Teste Aprovado </w:t>
-      </w:r>
-      <w:proofErr w:type="gramStart"/>
+      <w:r>
+        <w:t xml:space="preserve">Data de Início: </w:t>
+      </w:r>
       <w:r>
         <w:rPr>
           <w:highlight w:val="yellow"/>
         </w:rPr>
-        <w:t>[</w:t>
+        <w:t>10</w:t>
       </w:r>
       <w:r>
         <w:rPr>
           <w:highlight w:val="yellow"/>
         </w:rPr>
-        <w:t xml:space="preserve">  </w:t>
+        <w:t>/</w:t>
       </w:r>
       <w:r>
         <w:rPr>
           <w:highlight w:val="yellow"/>
         </w:rPr>
-        <w:t>]</w:t>
-      </w:r>
-      <w:proofErr w:type="gramEnd"/>
-      <w:r>
-        <w:t xml:space="preserve">  - Teste Reprovado </w:t>
+        <w:t>03</w:t>
       </w:r>
       <w:r>
         <w:rPr>
           <w:highlight w:val="yellow"/>
         </w:rPr>
-        <w:t>[</w:t>
+        <w:t>/</w:t>
       </w:r>
       <w:r>
         <w:rPr>
           <w:highlight w:val="yellow"/>
         </w:rPr>
-        <w:t xml:space="preserve">  </w:t>
+        <w:t>2026</w:t>
       </w:r>
       <w:r>
         <w:rPr>
           <w:highlight w:val="yellow"/>
         </w:rPr>
-        <w:t>]</w:t>
-      </w:r>
-    </w:p>
-    <w:p>
-      <w:pPr>
-        <w:jc w:val="right"/>
-      </w:pPr>
-      <w:r>
-        <w:t xml:space="preserve">Data de Início: </w:t>
-      </w:r>
-      <w:proofErr w:type="spellStart"/>
+        <w:t xml:space="preserve"> </w:t>
+      </w:r>
+      <w:r>
+        <w:t>15:40</w:t>
+      </w:r>
+      <w:r>
+        <w:t xml:space="preserve"> - Data de Conclusão: </w:t>
+      </w:r>
       <w:r>
         <w:rPr>
           <w:highlight w:val="yellow"/>
         </w:rPr>
-        <w:t>dd</w:t>
-      </w:r>
-      <w:proofErr w:type="spellEnd"/>
+        <w:t>10</w:t>
+      </w:r>
       <w:r>
         <w:rPr>
           <w:highlight w:val="yellow"/>
         </w:rPr>
-        <w:t>/mm/</w:t>
-      </w:r>
-      <w:proofErr w:type="spellStart"/>
-      <w:proofErr w:type="gramStart"/>
+        <w:t>/</w:t>
+      </w:r>
       <w:r>
         <w:rPr>
           <w:highlight w:val="yellow"/>
         </w:rPr>
-        <w:t>aaaa</w:t>
-      </w:r>
-      <w:proofErr w:type="spellEnd"/>
+        <w:t>03</w:t>
+      </w:r>
       <w:r>
         <w:rPr>
           <w:highlight w:val="yellow"/>
         </w:rPr>
-        <w:t xml:space="preserve">  </w:t>
-      </w:r>
-      <w:proofErr w:type="spellStart"/>
+        <w:t>/</w:t>
+      </w:r>
       <w:r>
         <w:rPr>
           <w:highlight w:val="yellow"/>
         </w:rPr>
-        <w:t>hh</w:t>
-      </w:r>
-      <w:proofErr w:type="gramEnd"/>
+        <w:t>2026</w:t>
+      </w:r>
       <w:r>
         <w:rPr>
           <w:highlight w:val="yellow"/>
         </w:rPr>
-        <w:t>:mm</w:t>
-      </w:r>
-      <w:proofErr w:type="spellEnd"/>
-      <w:r>
-        <w:t xml:space="preserve"> -  Data de Conclusão: </w:t>
-      </w:r>
-      <w:proofErr w:type="spellStart"/>
-      <w:r>
-        <w:rPr>
-          <w:highlight w:val="yellow"/>
-        </w:rPr>
-        <w:t>dd</w:t>
-      </w:r>
-      <w:proofErr w:type="spellEnd"/>
-      <w:r>
-        <w:rPr>
-          <w:highlight w:val="yellow"/>
-        </w:rPr>
-        <w:t>/mm/</w:t>
-      </w:r>
-      <w:proofErr w:type="spellStart"/>
-      <w:r>
-        <w:rPr>
-          <w:highlight w:val="yellow"/>
-        </w:rPr>
-        <w:t>aaaa</w:t>
-      </w:r>
-      <w:proofErr w:type="spellEnd"/>
-      <w:r>
-        <w:rPr>
-          <w:highlight w:val="yellow"/>
-        </w:rPr>
-        <w:t xml:space="preserve">  </w:t>
-      </w:r>
-      <w:proofErr w:type="spellStart"/>
-      <w:r>
-        <w:rPr>
-          <w:highlight w:val="yellow"/>
-        </w:rPr>
-        <w:t>hh:mm</w:t>
-      </w:r>
-      <w:proofErr w:type="spellEnd"/>
-    </w:p>
-    <w:p>
-      <w:pPr>
-        <w:jc w:val="right"/>
-        <w:rPr>
-          <w:b/>
-          <w:color w:val="C4415A"/>
-        </w:rPr>
-      </w:pPr>
-    </w:p>
-    <w:p>
-      <w:pPr>
-        <w:rPr>
-          <w:b/>
-          <w:color w:val="C4415A"/>
-        </w:rPr>
-      </w:pPr>
-    </w:p>
-    <w:p>
-      <w:pPr>
-        <w:rPr>
-          <w:b/>
-          <w:color w:val="C4415A"/>
-        </w:rPr>
-      </w:pPr>
-    </w:p>
-    <w:p>
-      <w:pPr>
-        <w:rPr>
-          <w:b/>
-          <w:color w:val="C4415A"/>
-        </w:rPr>
-      </w:pPr>
-    </w:p>
-    <w:p>
-      <w:pPr>
-        <w:rPr>
-          <w:b/>
-          <w:color w:val="C4415A"/>
-        </w:rPr>
-      </w:pPr>
-    </w:p>
-    <w:p>
-      <w:pPr>
-        <w:rPr>
-          <w:b/>
-          <w:color w:val="C4415A"/>
-        </w:rPr>
-      </w:pPr>
-    </w:p>
-    <w:p>
-      <w:pPr>
-        <w:rPr>
-          <w:b/>
-          <w:color w:val="C4415A"/>
-        </w:rPr>
-      </w:pPr>
-    </w:p>
-    <w:p>
-      <w:pPr>
-        <w:pStyle w:val="Ttulo2"/>
-        <w:spacing w:before="292"/>
-        <w:ind w:left="0"/>
-        <w:jc w:val="center"/>
-        <w:rPr>
-          <w:b/>
-          <w:color w:val="C4415A"/>
-        </w:rPr>
-      </w:pPr>
-      <w:r>
-        <w:rPr>
-          <w:b/>
-          <w:color w:val="C4415A"/>
-        </w:rPr>
-        <w:t xml:space="preserve">Caso de Teste: </w:t>
-      </w:r>
-      <w:r>
-        <w:rPr>
-          <w:b/>
-          <w:color w:val="C4415A"/>
-        </w:rPr>
-        <w:t>Excluir</w:t>
-      </w:r>
-    </w:p>
-    <w:p/>
-    <w:p>
-      <w:r>
-        <w:rPr>
-          <w:b/>
-          <w:bCs/>
-        </w:rPr>
-        <w:t>ID do Caso de Teste:</w:t>
-      </w:r>
-      <w:r>
         <w:t xml:space="preserve"> </w:t>
       </w:r>
       <w:r>
-        <w:t>TC-00</w:t>
-      </w:r>
-      <w:r>
-        <w:t>2</w:t>
-      </w:r>
-      <w:r>
-        <w:t xml:space="preserve"> - </w:t>
-      </w:r>
-      <w:r>
-        <w:t>Excluir</w:t>
-      </w:r>
-    </w:p>
-    <w:p/>
-    <w:p>
-      <w:r>
-        <w:rPr>
-          <w:b/>
-          <w:bCs/>
-        </w:rPr>
-        <w:t>Propósito:</w:t>
-      </w:r>
-      <w:r>
-        <w:t xml:space="preserve"> </w:t>
-      </w:r>
-      <w:r>
-        <w:t xml:space="preserve">Excluir </w:t>
-      </w:r>
-      <w:r>
-        <w:rPr>
-          <w:b/>
-          <w:bCs/>
-        </w:rPr>
-        <w:t>UM</w:t>
-      </w:r>
-      <w:r>
-        <w:t xml:space="preserve"> cadastro d</w:t>
-      </w:r>
-      <w:r>
-        <w:t>o</w:t>
-      </w:r>
-      <w:r>
-        <w:t xml:space="preserve"> cliente no Projeto-API executando de servidor </w:t>
-      </w:r>
-      <w:r>
-        <w:rPr>
-          <w:b/>
-          <w:bCs/>
-        </w:rPr>
-        <w:t>local</w:t>
-      </w:r>
-      <w:r>
-        <w:t xml:space="preserve"> através do </w:t>
-      </w:r>
-      <w:proofErr w:type="spellStart"/>
-      <w:r>
-        <w:rPr>
-          <w:b/>
-          <w:bCs/>
-        </w:rPr>
-        <w:t>Selenium</w:t>
-      </w:r>
-      <w:proofErr w:type="spellEnd"/>
-      <w:r>
-        <w:rPr>
-          <w:b/>
-          <w:bCs/>
-        </w:rPr>
-        <w:t xml:space="preserve"> IDE.</w:t>
-      </w:r>
-    </w:p>
-    <w:p/>
-    <w:p>
-      <w:pPr>
-        <w:rPr>
-          <w:b/>
-          <w:bCs/>
-        </w:rPr>
-      </w:pPr>
-      <w:r>
-        <w:rPr>
-          <w:b/>
-          <w:bCs/>
-        </w:rPr>
-        <w:t>Preparação:</w:t>
-      </w:r>
-    </w:p>
-    <w:p>
-      <w:r>
-        <w:t xml:space="preserve">-No Google Chrome entrar na extensão </w:t>
-      </w:r>
-      <w:proofErr w:type="spellStart"/>
-      <w:r>
-        <w:t>Selenium</w:t>
-      </w:r>
-      <w:proofErr w:type="spellEnd"/>
-      <w:r>
-        <w:t xml:space="preserve"> IDE e abrir o link gerado pelo http-</w:t>
-      </w:r>
-      <w:proofErr w:type="gramStart"/>
-      <w:r>
-        <w:t>server</w:t>
-      </w:r>
-      <w:proofErr w:type="gramEnd"/>
-      <w:r>
-        <w:t xml:space="preserve"> para o Projeto-API. Deverá criar o </w:t>
-      </w:r>
-      <w:proofErr w:type="gramStart"/>
-      <w:r>
-        <w:t xml:space="preserve">arquivo </w:t>
-      </w:r>
-      <w:proofErr w:type="spellStart"/>
-      <w:r>
-        <w:t>Excluir</w:t>
-      </w:r>
-      <w:proofErr w:type="gramEnd"/>
-      <w:r>
-        <w:t>.side</w:t>
-      </w:r>
-      <w:proofErr w:type="spellEnd"/>
-      <w:r>
-        <w:t xml:space="preserve"> com a gravação do procedimento de Exclusão do Projeto-API. Após gerar este arquivo testar pelo menos duas vezes e observar o comportamento funcional do sistema</w:t>
-      </w:r>
-      <w:r>
-        <w:t xml:space="preserve"> através do teste automático.</w:t>
-      </w:r>
-    </w:p>
-    <w:p/>
-    <w:p>
-      <w:pPr>
-        <w:rPr>
-          <w:b/>
-          <w:bCs/>
-        </w:rPr>
-      </w:pPr>
-      <w:r>
-        <w:rPr>
-          <w:b/>
-          <w:bCs/>
-        </w:rPr>
-        <w:t>Resultado Esperado:</w:t>
-      </w:r>
-    </w:p>
-    <w:p>
-      <w:r>
-        <w:t xml:space="preserve">- O resultado esperado é que a cada vez que execute o </w:t>
-      </w:r>
-      <w:proofErr w:type="spellStart"/>
-      <w:r>
-        <w:t>Excluir.side</w:t>
-      </w:r>
-      <w:proofErr w:type="spellEnd"/>
-      <w:r>
-        <w:t xml:space="preserve"> seja retirado um cadastro do Projeto-API.</w:t>
-      </w:r>
-    </w:p>
-    <w:p/>
-    <w:p/>
-    <w:p>
-      <w:pPr>
-        <w:rPr>
-          <w:b/>
-          <w:bCs/>
-        </w:rPr>
-      </w:pPr>
-      <w:r>
-        <w:rPr>
-          <w:b/>
-          <w:bCs/>
-        </w:rPr>
-        <w:t>Relatório de Defeitos:</w:t>
-      </w:r>
-    </w:p>
-    <w:p>
-      <w:pPr>
-        <w:pBdr>
-          <w:top w:val="single" w:sz="4" w:space="1" w:color="auto"/>
-          <w:left w:val="single" w:sz="4" w:space="4" w:color="auto"/>
-          <w:bottom w:val="single" w:sz="4" w:space="1" w:color="auto"/>
-          <w:right w:val="single" w:sz="4" w:space="0" w:color="auto"/>
-          <w:between w:val="single" w:sz="4" w:space="1" w:color="auto"/>
-          <w:bar w:val="single" w:sz="4" w:color="auto"/>
-        </w:pBdr>
-        <w:rPr>
-          <w:b/>
-          <w:bCs/>
-        </w:rPr>
-      </w:pPr>
-      <w:r>
-        <w:rPr>
-          <w:b/>
-          <w:bCs/>
-          <w:highlight w:val="yellow"/>
-        </w:rPr>
-        <w:t xml:space="preserve">&lt;Caso </w:t>
-      </w:r>
-      <w:r>
-        <w:rPr>
-          <w:b/>
-          <w:bCs/>
-          <w:highlight w:val="yellow"/>
-        </w:rPr>
-        <w:t xml:space="preserve">tenha um erro </w:t>
-      </w:r>
-      <w:r>
-        <w:rPr>
-          <w:b/>
-          <w:bCs/>
-          <w:highlight w:val="yellow"/>
-        </w:rPr>
-        <w:t>fornecer data, hora</w:t>
-      </w:r>
-      <w:r>
-        <w:rPr>
-          <w:b/>
-          <w:bCs/>
-          <w:highlight w:val="yellow"/>
-        </w:rPr>
-        <w:t xml:space="preserve"> e descrição do erro</w:t>
-      </w:r>
-      <w:r>
-        <w:rPr>
-          <w:b/>
-          <w:bCs/>
-          <w:highlight w:val="yellow"/>
-        </w:rPr>
-        <w:t xml:space="preserve"> &gt;</w:t>
-      </w:r>
-    </w:p>
-    <w:p>
-      <w:pPr>
-        <w:rPr>
-          <w:b/>
-          <w:color w:val="C4415A"/>
-        </w:rPr>
-      </w:pPr>
-    </w:p>
-    <w:p>
-      <w:pPr>
-        <w:jc w:val="right"/>
-      </w:pPr>
-      <w:r>
-        <w:t xml:space="preserve">Teste Aprovado </w:t>
-      </w:r>
-      <w:proofErr w:type="gramStart"/>
-      <w:r>
-        <w:rPr>
-          <w:highlight w:val="yellow"/>
-        </w:rPr>
-        <w:t>[</w:t>
-      </w:r>
-      <w:r>
-        <w:rPr>
-          <w:highlight w:val="yellow"/>
-        </w:rPr>
-        <w:t xml:space="preserve">  </w:t>
-      </w:r>
-      <w:r>
-        <w:rPr>
-          <w:highlight w:val="yellow"/>
-        </w:rPr>
-        <w:t>]</w:t>
-      </w:r>
-      <w:proofErr w:type="gramEnd"/>
-      <w:r>
-        <w:t xml:space="preserve">  - Teste Reprovado </w:t>
-      </w:r>
-      <w:r>
-        <w:rPr>
-          <w:highlight w:val="yellow"/>
-        </w:rPr>
-        <w:t>[</w:t>
-      </w:r>
-      <w:r>
-        <w:rPr>
-          <w:highlight w:val="yellow"/>
-        </w:rPr>
-        <w:t xml:space="preserve">  </w:t>
-      </w:r>
-      <w:r>
-        <w:rPr>
-          <w:highlight w:val="yellow"/>
-        </w:rPr>
-        <w:t>]</w:t>
-      </w:r>
-    </w:p>
-    <w:p>
-      <w:pPr>
-        <w:jc w:val="right"/>
-        <w:rPr>
-          <w:b/>
-          <w:color w:val="C4415A"/>
-        </w:rPr>
-      </w:pPr>
-      <w:r>
-        <w:t xml:space="preserve">Data de Início: </w:t>
-      </w:r>
-      <w:proofErr w:type="spellStart"/>
-      <w:r>
-        <w:rPr>
-          <w:highlight w:val="yellow"/>
-        </w:rPr>
-        <w:t>dd</w:t>
-      </w:r>
-      <w:proofErr w:type="spellEnd"/>
-      <w:r>
-        <w:rPr>
-          <w:highlight w:val="yellow"/>
-        </w:rPr>
-        <w:t>/mm/</w:t>
-      </w:r>
-      <w:proofErr w:type="spellStart"/>
-      <w:proofErr w:type="gramStart"/>
-      <w:r>
-        <w:rPr>
-          <w:highlight w:val="yellow"/>
-        </w:rPr>
-        <w:t>aaaa</w:t>
-      </w:r>
-      <w:proofErr w:type="spellEnd"/>
-      <w:r>
-        <w:rPr>
-          <w:highlight w:val="yellow"/>
-        </w:rPr>
-        <w:t xml:space="preserve">  </w:t>
-      </w:r>
-      <w:proofErr w:type="spellStart"/>
-      <w:r>
-        <w:rPr>
-          <w:highlight w:val="yellow"/>
-        </w:rPr>
-        <w:t>hh</w:t>
-      </w:r>
-      <w:proofErr w:type="gramEnd"/>
-      <w:r>
-        <w:rPr>
-          <w:highlight w:val="yellow"/>
-        </w:rPr>
-        <w:t>:mm</w:t>
-      </w:r>
-      <w:proofErr w:type="spellEnd"/>
-      <w:r>
-        <w:t xml:space="preserve"> -  Data de Conclusão: </w:t>
-      </w:r>
-      <w:proofErr w:type="spellStart"/>
-      <w:r>
-        <w:rPr>
-          <w:highlight w:val="yellow"/>
-        </w:rPr>
-        <w:t>dd</w:t>
-      </w:r>
-      <w:proofErr w:type="spellEnd"/>
-      <w:r>
-        <w:rPr>
-          <w:highlight w:val="yellow"/>
-        </w:rPr>
-        <w:t>/mm/</w:t>
-      </w:r>
-      <w:proofErr w:type="spellStart"/>
-      <w:r>
-        <w:rPr>
-          <w:highlight w:val="yellow"/>
-        </w:rPr>
-        <w:t>aaaa</w:t>
-      </w:r>
-      <w:proofErr w:type="spellEnd"/>
-      <w:r>
-        <w:rPr>
-          <w:highlight w:val="yellow"/>
-        </w:rPr>
-        <w:t xml:space="preserve">  </w:t>
-      </w:r>
-      <w:proofErr w:type="spellStart"/>
-      <w:r>
-        <w:rPr>
-          <w:highlight w:val="yellow"/>
-        </w:rPr>
-        <w:t>hh:mm</w:t>
-      </w:r>
-      <w:proofErr w:type="spellEnd"/>
-    </w:p>
-    <w:p>
-      <w:pPr>
-        <w:rPr>
-          <w:b/>
-          <w:color w:val="C4415A"/>
-        </w:rPr>
-      </w:pPr>
-    </w:p>
-    <w:p>
-      <w:pPr>
-        <w:rPr>
-          <w:b/>
-          <w:color w:val="C4415A"/>
-        </w:rPr>
-      </w:pPr>
-    </w:p>
-    <w:p>
-      <w:pPr>
-        <w:rPr>
-          <w:b/>
-          <w:color w:val="C4415A"/>
-        </w:rPr>
-      </w:pPr>
-    </w:p>
-    <w:p>
-      <w:pPr>
-        <w:rPr>
-          <w:b/>
-          <w:color w:val="C4415A"/>
-        </w:rPr>
-      </w:pPr>
-    </w:p>
-    <w:p>
-      <w:pPr>
-        <w:rPr>
-          <w:b/>
-          <w:color w:val="C4415A"/>
-        </w:rPr>
-      </w:pPr>
-    </w:p>
-    <w:p>
-      <w:pPr>
-        <w:rPr>
-          <w:b/>
-          <w:color w:val="C4415A"/>
-        </w:rPr>
-      </w:pPr>
-    </w:p>
-    <w:p>
-      <w:pPr>
-        <w:rPr>
-          <w:b/>
-          <w:color w:val="C4415A"/>
-        </w:rPr>
-      </w:pPr>
-    </w:p>
-    <w:p>
-      <w:pPr>
-        <w:rPr>
-          <w:b/>
-          <w:color w:val="C4415A"/>
-        </w:rPr>
-      </w:pPr>
-    </w:p>
-    <w:p>
-      <w:pPr>
-        <w:rPr>
-          <w:b/>
-          <w:color w:val="C4415A"/>
-        </w:rPr>
-      </w:pPr>
-    </w:p>
-    <w:p>
-      <w:pPr>
-        <w:rPr>
-          <w:b/>
-          <w:color w:val="C4415A"/>
-        </w:rPr>
-      </w:pPr>
-    </w:p>
-    <w:p>
-      <w:pPr>
-        <w:pStyle w:val="Ttulo2"/>
-        <w:spacing w:before="292"/>
-        <w:ind w:left="0"/>
-        <w:jc w:val="center"/>
-        <w:rPr>
-          <w:b/>
-          <w:color w:val="C4415A"/>
-        </w:rPr>
-      </w:pPr>
-      <w:r>
-        <w:rPr>
-          <w:b/>
-          <w:color w:val="C4415A"/>
-        </w:rPr>
-        <w:lastRenderedPageBreak/>
-        <w:t xml:space="preserve">Caso de Teste: </w:t>
-      </w:r>
-      <w:r>
-        <w:rPr>
-          <w:b/>
-          <w:color w:val="C4415A"/>
-        </w:rPr>
-        <w:t>Editar</w:t>
-      </w:r>
-    </w:p>
-    <w:p/>
-    <w:p>
-      <w:r>
-        <w:rPr>
-          <w:b/>
-          <w:bCs/>
-        </w:rPr>
-        <w:t>ID do Caso de Teste:</w:t>
-      </w:r>
-      <w:r>
-        <w:t xml:space="preserve"> </w:t>
-      </w:r>
-      <w:r>
-        <w:t>TC-00</w:t>
-      </w:r>
-      <w:r>
-        <w:t>3</w:t>
-      </w:r>
-      <w:r>
-        <w:t xml:space="preserve"> - </w:t>
-      </w:r>
-      <w:r>
-        <w:t>Editar</w:t>
-      </w:r>
-    </w:p>
-    <w:p/>
-    <w:p>
-      <w:r>
-        <w:rPr>
-          <w:b/>
-          <w:bCs/>
-        </w:rPr>
-        <w:t>Propósito:</w:t>
-      </w:r>
-      <w:r>
-        <w:t xml:space="preserve"> </w:t>
-      </w:r>
-      <w:r>
-        <w:t>Editar</w:t>
-      </w:r>
-      <w:r>
-        <w:t xml:space="preserve"> </w:t>
-      </w:r>
-      <w:r>
-        <w:rPr>
-          <w:b/>
-          <w:bCs/>
-        </w:rPr>
-        <w:t xml:space="preserve">O </w:t>
-      </w:r>
-      <w:r>
-        <w:t xml:space="preserve">cadastro de cliente </w:t>
-      </w:r>
-      <w:r>
-        <w:t xml:space="preserve">com o </w:t>
-      </w:r>
-      <w:r>
-        <w:rPr>
-          <w:b/>
-          <w:bCs/>
-        </w:rPr>
-        <w:t>nome</w:t>
-      </w:r>
-      <w:r>
-        <w:t xml:space="preserve"> </w:t>
-      </w:r>
-      <w:proofErr w:type="spellStart"/>
-      <w:r>
-        <w:t>fwefwefwe</w:t>
-      </w:r>
-      <w:proofErr w:type="spellEnd"/>
-      <w:r>
-        <w:t xml:space="preserve"> e </w:t>
-      </w:r>
-      <w:r>
-        <w:rPr>
-          <w:b/>
-          <w:bCs/>
-        </w:rPr>
-        <w:t>endereço</w:t>
-      </w:r>
-      <w:r>
-        <w:t xml:space="preserve"> </w:t>
-      </w:r>
-      <w:proofErr w:type="spellStart"/>
-      <w:r>
-        <w:t>sSa</w:t>
-      </w:r>
-      <w:proofErr w:type="spellEnd"/>
-      <w:r>
-        <w:t xml:space="preserve"> </w:t>
-      </w:r>
-      <w:r>
-        <w:t xml:space="preserve">no Projeto-API executando de servidor </w:t>
-      </w:r>
-      <w:r>
-        <w:rPr>
-          <w:b/>
-          <w:bCs/>
-        </w:rPr>
-        <w:t>local</w:t>
-      </w:r>
-      <w:r>
-        <w:t xml:space="preserve"> através do </w:t>
-      </w:r>
-      <w:proofErr w:type="spellStart"/>
-      <w:r>
-        <w:rPr>
-          <w:b/>
-          <w:bCs/>
-        </w:rPr>
-        <w:t>Selenium</w:t>
-      </w:r>
-      <w:proofErr w:type="spellEnd"/>
-      <w:r>
-        <w:rPr>
-          <w:b/>
-          <w:bCs/>
-        </w:rPr>
-        <w:t xml:space="preserve"> IDE.</w:t>
-      </w:r>
-    </w:p>
-    <w:p/>
-    <w:p>
-      <w:pPr>
-        <w:rPr>
-          <w:b/>
-          <w:bCs/>
-        </w:rPr>
-      </w:pPr>
-      <w:r>
-        <w:rPr>
-          <w:b/>
-          <w:bCs/>
-        </w:rPr>
-        <w:t>Preparação:</w:t>
-      </w:r>
-    </w:p>
-    <w:p>
-      <w:r>
-        <w:t xml:space="preserve">-No Google Chrome entrar na extensão </w:t>
-      </w:r>
-      <w:proofErr w:type="spellStart"/>
-      <w:r>
-        <w:t>Selenium</w:t>
-      </w:r>
-      <w:proofErr w:type="spellEnd"/>
-      <w:r>
-        <w:t xml:space="preserve"> IDE e abrir o link gerado pelo http-</w:t>
-      </w:r>
-      <w:proofErr w:type="gramStart"/>
-      <w:r>
-        <w:t>server</w:t>
-      </w:r>
-      <w:proofErr w:type="gramEnd"/>
-      <w:r>
-        <w:t xml:space="preserve"> para o Projeto-API. Deverá criar o </w:t>
-      </w:r>
-      <w:proofErr w:type="gramStart"/>
-      <w:r>
-        <w:t xml:space="preserve">arquivo </w:t>
-      </w:r>
-      <w:proofErr w:type="spellStart"/>
-      <w:r>
-        <w:t>Editar</w:t>
-      </w:r>
-      <w:proofErr w:type="gramEnd"/>
-      <w:r>
-        <w:t>.side</w:t>
-      </w:r>
-      <w:proofErr w:type="spellEnd"/>
-      <w:r>
-        <w:t xml:space="preserve"> com a gravação do procedimento de </w:t>
-      </w:r>
-      <w:r>
-        <w:t>edição</w:t>
-      </w:r>
-      <w:r>
-        <w:t xml:space="preserve"> do Projeto-API. Após gerar este arquivo testar pelo menos </w:t>
-      </w:r>
-      <w:proofErr w:type="gramStart"/>
-      <w:r>
-        <w:t>uma</w:t>
-      </w:r>
-      <w:r>
-        <w:t xml:space="preserve"> vezes</w:t>
-      </w:r>
-      <w:proofErr w:type="gramEnd"/>
-      <w:r>
-        <w:t xml:space="preserve"> e observar o comportamento funcional do sistema através do teste automático.</w:t>
-      </w:r>
-    </w:p>
-    <w:p/>
-    <w:p>
-      <w:pPr>
-        <w:rPr>
-          <w:b/>
-          <w:bCs/>
-        </w:rPr>
-      </w:pPr>
-      <w:r>
-        <w:rPr>
-          <w:b/>
-          <w:bCs/>
-        </w:rPr>
-        <w:t>Resultado Esperado:</w:t>
-      </w:r>
-    </w:p>
-    <w:p>
-      <w:r>
-        <w:t xml:space="preserve">- O resultado esperado é que a cada vez que execute o </w:t>
-      </w:r>
-      <w:proofErr w:type="spellStart"/>
-      <w:r>
-        <w:t>Editar</w:t>
-      </w:r>
-      <w:r>
-        <w:t>.side</w:t>
-      </w:r>
-      <w:proofErr w:type="spellEnd"/>
-      <w:r>
-        <w:t xml:space="preserve"> seja </w:t>
-      </w:r>
-      <w:r>
-        <w:t xml:space="preserve">editar um </w:t>
-      </w:r>
-      <w:r>
-        <w:t>cadastro do Projeto-API.</w:t>
-      </w:r>
-    </w:p>
-    <w:p/>
-    <w:p/>
-    <w:p>
-      <w:pPr>
-        <w:rPr>
-          <w:b/>
-          <w:bCs/>
-        </w:rPr>
-      </w:pPr>
-      <w:r>
-        <w:rPr>
-          <w:b/>
-          <w:bCs/>
-        </w:rPr>
-        <w:t>Relatório de Defeitos:</w:t>
-      </w:r>
-    </w:p>
-    <w:p>
-      <w:pPr>
-        <w:rPr>
-          <w:b/>
-          <w:bCs/>
-        </w:rPr>
-      </w:pPr>
-    </w:p>
-    <w:p>
-      <w:pPr>
-        <w:pBdr>
-          <w:top w:val="single" w:sz="4" w:space="1" w:color="auto"/>
-          <w:left w:val="single" w:sz="4" w:space="4" w:color="auto"/>
-          <w:bottom w:val="single" w:sz="4" w:space="1" w:color="auto"/>
-          <w:right w:val="single" w:sz="4" w:space="0" w:color="auto"/>
-          <w:between w:val="single" w:sz="4" w:space="1" w:color="auto"/>
-          <w:bar w:val="single" w:sz="4" w:color="auto"/>
-        </w:pBdr>
-        <w:rPr>
-          <w:b/>
-          <w:bCs/>
-        </w:rPr>
-      </w:pPr>
-      <w:r>
-        <w:rPr>
-          <w:b/>
-          <w:bCs/>
-          <w:highlight w:val="yellow"/>
-        </w:rPr>
-        <w:t xml:space="preserve">&lt;Caso </w:t>
-      </w:r>
-      <w:r>
-        <w:rPr>
-          <w:b/>
-          <w:bCs/>
-          <w:highlight w:val="yellow"/>
-        </w:rPr>
-        <w:t xml:space="preserve">tenha um erro </w:t>
-      </w:r>
-      <w:r>
-        <w:rPr>
-          <w:b/>
-          <w:bCs/>
-          <w:highlight w:val="yellow"/>
-        </w:rPr>
-        <w:t>fornecer data, hora</w:t>
-      </w:r>
-      <w:r>
-        <w:rPr>
-          <w:b/>
-          <w:bCs/>
-          <w:highlight w:val="yellow"/>
-        </w:rPr>
-        <w:t xml:space="preserve"> e descrição do erro</w:t>
-      </w:r>
-      <w:r>
-        <w:rPr>
-          <w:b/>
-          <w:bCs/>
-          <w:highlight w:val="yellow"/>
-        </w:rPr>
-        <w:t xml:space="preserve"> &gt;</w:t>
-      </w:r>
-    </w:p>
-    <w:p>
-      <w:pPr>
-        <w:rPr>
-          <w:b/>
-          <w:bCs/>
-        </w:rPr>
-      </w:pPr>
-    </w:p>
-    <w:p>
-      <w:pPr>
-        <w:rPr>
-          <w:b/>
-          <w:bCs/>
-        </w:rPr>
-      </w:pPr>
-    </w:p>
-    <w:p>
-      <w:pPr>
-        <w:jc w:val="right"/>
-      </w:pPr>
-      <w:r>
-        <w:t xml:space="preserve">Teste Aprovado </w:t>
-      </w:r>
-      <w:proofErr w:type="gramStart"/>
-      <w:r>
-        <w:rPr>
-          <w:highlight w:val="yellow"/>
-        </w:rPr>
-        <w:t>[</w:t>
-      </w:r>
-      <w:r>
-        <w:rPr>
-          <w:highlight w:val="yellow"/>
-        </w:rPr>
-        <w:t xml:space="preserve">  </w:t>
-      </w:r>
-      <w:r>
-        <w:rPr>
-          <w:highlight w:val="yellow"/>
-        </w:rPr>
-        <w:t>]</w:t>
-      </w:r>
-      <w:proofErr w:type="gramEnd"/>
-      <w:r>
-        <w:t xml:space="preserve">  - Teste Reprovado </w:t>
-      </w:r>
-      <w:r>
-        <w:rPr>
-          <w:highlight w:val="yellow"/>
-        </w:rPr>
-        <w:t>[</w:t>
-      </w:r>
-      <w:r>
-        <w:rPr>
-          <w:highlight w:val="yellow"/>
-        </w:rPr>
-        <w:t xml:space="preserve">  </w:t>
-      </w:r>
-      <w:r>
-        <w:rPr>
-          <w:highlight w:val="yellow"/>
-        </w:rPr>
-        <w:t>]</w:t>
-      </w:r>
-    </w:p>
-    <w:p>
-      <w:pPr>
-        <w:jc w:val="right"/>
-        <w:rPr>
-          <w:b/>
-          <w:color w:val="C4415A"/>
-        </w:rPr>
-      </w:pPr>
-      <w:r>
-        <w:t xml:space="preserve">Data de Início: </w:t>
-      </w:r>
-      <w:proofErr w:type="spellStart"/>
-      <w:r>
-        <w:rPr>
-          <w:highlight w:val="yellow"/>
-        </w:rPr>
-        <w:t>dd</w:t>
-      </w:r>
-      <w:proofErr w:type="spellEnd"/>
-      <w:r>
-        <w:rPr>
-          <w:highlight w:val="yellow"/>
-        </w:rPr>
-        <w:t>/mm/</w:t>
-      </w:r>
-      <w:proofErr w:type="spellStart"/>
-      <w:proofErr w:type="gramStart"/>
-      <w:r>
-        <w:rPr>
-          <w:highlight w:val="yellow"/>
-        </w:rPr>
-        <w:t>aaaa</w:t>
-      </w:r>
-      <w:proofErr w:type="spellEnd"/>
-      <w:r>
-        <w:rPr>
-          <w:highlight w:val="yellow"/>
-        </w:rPr>
-        <w:t xml:space="preserve">  </w:t>
-      </w:r>
-      <w:proofErr w:type="spellStart"/>
-      <w:r>
-        <w:rPr>
-          <w:highlight w:val="yellow"/>
-        </w:rPr>
-        <w:t>hh</w:t>
-      </w:r>
-      <w:proofErr w:type="gramEnd"/>
-      <w:r>
-        <w:rPr>
-          <w:highlight w:val="yellow"/>
-        </w:rPr>
-        <w:t>:mm</w:t>
-      </w:r>
-      <w:proofErr w:type="spellEnd"/>
-      <w:r>
-        <w:t xml:space="preserve"> -  Data de Conclusão: </w:t>
-      </w:r>
-      <w:proofErr w:type="spellStart"/>
-      <w:r>
-        <w:rPr>
-          <w:highlight w:val="yellow"/>
-        </w:rPr>
-        <w:t>dd</w:t>
-      </w:r>
-      <w:proofErr w:type="spellEnd"/>
-      <w:r>
-        <w:rPr>
-          <w:highlight w:val="yellow"/>
-        </w:rPr>
-        <w:t>/mm/</w:t>
-      </w:r>
-      <w:proofErr w:type="spellStart"/>
-      <w:r>
-        <w:rPr>
-          <w:highlight w:val="yellow"/>
-        </w:rPr>
-        <w:t>aaaa</w:t>
-      </w:r>
-      <w:proofErr w:type="spellEnd"/>
-      <w:r>
-        <w:rPr>
-          <w:highlight w:val="yellow"/>
-        </w:rPr>
-        <w:t xml:space="preserve">  </w:t>
-      </w:r>
-      <w:proofErr w:type="spellStart"/>
-      <w:r>
-        <w:rPr>
-          <w:highlight w:val="yellow"/>
-        </w:rPr>
-        <w:t>hh:mm</w:t>
-      </w:r>
-      <w:proofErr w:type="spellEnd"/>
+        <w:t>1</w:t>
+      </w:r>
+      <w:r>
+        <w:t>6</w:t>
+      </w:r>
+      <w:r>
+        <w:t>:</w:t>
+      </w:r>
+      <w:r>
+        <w:t>1</w:t>
+      </w:r>
+      <w:r>
+        <w:t>0</w:t>
+      </w:r>
     </w:p>
     <w:sectPr>
       <w:headerReference w:type="default" r:id="rId11"/>
@@ -2813,7 +2794,7 @@
 </file>
 
 <file path=word/endnotes.xml><?xml version="1.0" encoding="utf-8"?>
-<w:endnotes xmlns:wpc="http://schemas.microsoft.com/office/word/2010/wordprocessingCanvas" xmlns:cx="http://schemas.microsoft.com/office/drawing/2014/chartex" xmlns:cx1="http://schemas.microsoft.com/office/drawing/2015/9/8/chartex" xmlns:cx2="http://schemas.microsoft.com/office/drawing/2015/10/21/chartex" xmlns:cx3="http://schemas.microsoft.com/office/drawing/2016/5/9/chartex" xmlns:cx4="http://schemas.microsoft.com/office/drawing/2016/5/10/chartex" xmlns:cx5="http://schemas.microsoft.com/office/drawing/2016/5/11/chartex" xmlns:cx6="http://schemas.microsoft.com/office/drawing/2016/5/12/chartex" xmlns:cx7="http://schemas.microsoft.com/office/drawing/2016/5/13/chartex" xmlns:cx8="http://schemas.microsoft.com/office/drawing/2016/5/14/chartex" xmlns:mc="http://schemas.openxmlformats.org/markup-compatibility/2006" xmlns:aink="http://schemas.microsoft.com/office/drawing/2016/ink" xmlns:am3d="http://schemas.microsoft.com/office/drawing/2017/model3d" xmlns:o="urn:schemas-microsoft-com:office:office" xmlns:oel="http://schemas.microsoft.com/office/2019/extlst" xmlns:r="http://schemas.openxmlformats.org/officeDocument/2006/relationships" xmlns:m="http://schemas.openxmlformats.org/officeDocument/2006/math" xmlns:v="urn:schemas-microsoft-com:vml" xmlns:wp14="http://schemas.microsoft.com/office/word/2010/wordprocessingDrawing" xmlns:wp="http://schemas.openxmlformats.org/drawingml/2006/wordprocessingDrawing" xmlns:w10="urn:schemas-microsoft-com:office:word" xmlns:w="http://schemas.openxmlformats.org/wordprocessingml/2006/main" xmlns:w14="http://schemas.microsoft.com/office/word/2010/wordml" xmlns:w15="http://schemas.microsoft.com/office/word/2012/wordml" xmlns:w16cex="http://schemas.microsoft.com/office/word/2018/wordml/cex" xmlns:w16cid="http://schemas.microsoft.com/office/word/2016/wordml/cid" xmlns:w16="http://schemas.microsoft.com/office/word/2018/wordml" xmlns:w16sdtdh="http://schemas.microsoft.com/office/word/2020/wordml/sdtdatahash" xmlns:w16se="http://schemas.microsoft.com/office/word/2015/wordml/symex" xmlns:wpg="http://schemas.microsoft.com/office/word/2010/wordprocessingGroup" xmlns:wpi="http://schemas.microsoft.com/office/word/2010/wordprocessingInk" xmlns:wne="http://schemas.microsoft.com/office/word/2006/wordml" xmlns:wps="http://schemas.microsoft.com/office/word/2010/wordprocessingShape" mc:Ignorable="w14 w15 w16se w16cid w16 w16cex w16sdtdh wp14">
+<w:endnotes xmlns:wpc="http://schemas.microsoft.com/office/word/2010/wordprocessingCanvas" xmlns:cx="http://schemas.microsoft.com/office/drawing/2014/chartex" xmlns:cx1="http://schemas.microsoft.com/office/drawing/2015/9/8/chartex" xmlns:cx2="http://schemas.microsoft.com/office/drawing/2015/10/21/chartex" xmlns:cx3="http://schemas.microsoft.com/office/drawing/2016/5/9/chartex" xmlns:cx4="http://schemas.microsoft.com/office/drawing/2016/5/10/chartex" xmlns:cx5="http://schemas.microsoft.com/office/drawing/2016/5/11/chartex" xmlns:cx6="http://schemas.microsoft.com/office/drawing/2016/5/12/chartex" xmlns:cx7="http://schemas.microsoft.com/office/drawing/2016/5/13/chartex" xmlns:cx8="http://schemas.microsoft.com/office/drawing/2016/5/14/chartex" xmlns:mc="http://schemas.openxmlformats.org/markup-compatibility/2006" xmlns:aink="http://schemas.microsoft.com/office/drawing/2016/ink" xmlns:am3d="http://schemas.microsoft.com/office/drawing/2017/model3d" xmlns:o="urn:schemas-microsoft-com:office:office" xmlns:oel="http://schemas.microsoft.com/office/2019/extlst" xmlns:r="http://schemas.openxmlformats.org/officeDocument/2006/relationships" xmlns:m="http://schemas.openxmlformats.org/officeDocument/2006/math" xmlns:v="urn:schemas-microsoft-com:vml" xmlns:wp14="http://schemas.microsoft.com/office/word/2010/wordprocessingDrawing" xmlns:wp="http://schemas.openxmlformats.org/drawingml/2006/wordprocessingDrawing" xmlns:w10="urn:schemas-microsoft-com:office:word" xmlns:w="http://schemas.openxmlformats.org/wordprocessingml/2006/main" xmlns:w14="http://schemas.microsoft.com/office/word/2010/wordml" xmlns:w15="http://schemas.microsoft.com/office/word/2012/wordml" xmlns:w16cex="http://schemas.microsoft.com/office/word/2018/wordml/cex" xmlns:w16cid="http://schemas.microsoft.com/office/word/2016/wordml/cid" xmlns:w16="http://schemas.microsoft.com/office/word/2018/wordml" xmlns:w16du="http://schemas.microsoft.com/office/word/2023/wordml/word16du" xmlns:w16sdtdh="http://schemas.microsoft.com/office/word/2020/wordml/sdtdatahash" xmlns:w16sdtfl="http://schemas.microsoft.com/office/word/2024/wordml/sdtformatlock" xmlns:w16se="http://schemas.microsoft.com/office/word/2015/wordml/symex" xmlns:wpg="http://schemas.microsoft.com/office/word/2010/wordprocessingGroup" xmlns:wpi="http://schemas.microsoft.com/office/word/2010/wordprocessingInk" xmlns:wne="http://schemas.microsoft.com/office/word/2006/wordml" xmlns:wps="http://schemas.microsoft.com/office/word/2010/wordprocessingShape" mc:Ignorable="w14 w15 w16se w16cid w16 w16cex w16sdtdh w16sdtfl w16du wp14">
   <w:endnote w:type="separator" w:id="-1">
     <w:p>
       <w:r>
@@ -2832,7 +2813,7 @@
 </file>
 
 <file path=word/footer1.xml><?xml version="1.0" encoding="utf-8"?>
-<w:ftr xmlns:wpc="http://schemas.microsoft.com/office/word/2010/wordprocessingCanvas" xmlns:cx="http://schemas.microsoft.com/office/drawing/2014/chartex" xmlns:cx1="http://schemas.microsoft.com/office/drawing/2015/9/8/chartex" xmlns:cx2="http://schemas.microsoft.com/office/drawing/2015/10/21/chartex" xmlns:cx3="http://schemas.microsoft.com/office/drawing/2016/5/9/chartex" xmlns:cx4="http://schemas.microsoft.com/office/drawing/2016/5/10/chartex" xmlns:cx5="http://schemas.microsoft.com/office/drawing/2016/5/11/chartex" xmlns:cx6="http://schemas.microsoft.com/office/drawing/2016/5/12/chartex" xmlns:cx7="http://schemas.microsoft.com/office/drawing/2016/5/13/chartex" xmlns:cx8="http://schemas.microsoft.com/office/drawing/2016/5/14/chartex" xmlns:mc="http://schemas.openxmlformats.org/markup-compatibility/2006" xmlns:aink="http://schemas.microsoft.com/office/drawing/2016/ink" xmlns:am3d="http://schemas.microsoft.com/office/drawing/2017/model3d" xmlns:o="urn:schemas-microsoft-com:office:office" xmlns:oel="http://schemas.microsoft.com/office/2019/extlst" xmlns:r="http://schemas.openxmlformats.org/officeDocument/2006/relationships" xmlns:m="http://schemas.openxmlformats.org/officeDocument/2006/math" xmlns:v="urn:schemas-microsoft-com:vml" xmlns:wp14="http://schemas.microsoft.com/office/word/2010/wordprocessingDrawing" xmlns:wp="http://schemas.openxmlformats.org/drawingml/2006/wordprocessingDrawing" xmlns:w10="urn:schemas-microsoft-com:office:word" xmlns:w="http://schemas.openxmlformats.org/wordprocessingml/2006/main" xmlns:w14="http://schemas.microsoft.com/office/word/2010/wordml" xmlns:w15="http://schemas.microsoft.com/office/word/2012/wordml" xmlns:w16cex="http://schemas.microsoft.com/office/word/2018/wordml/cex" xmlns:w16cid="http://schemas.microsoft.com/office/word/2016/wordml/cid" xmlns:w16="http://schemas.microsoft.com/office/word/2018/wordml" xmlns:w16sdtdh="http://schemas.microsoft.com/office/word/2020/wordml/sdtdatahash" xmlns:w16se="http://schemas.microsoft.com/office/word/2015/wordml/symex" xmlns:wpg="http://schemas.microsoft.com/office/word/2010/wordprocessingGroup" xmlns:wpi="http://schemas.microsoft.com/office/word/2010/wordprocessingInk" xmlns:wne="http://schemas.microsoft.com/office/word/2006/wordml" xmlns:wps="http://schemas.microsoft.com/office/word/2010/wordprocessingShape" mc:Ignorable="w14 w15 w16se w16cid w16 w16cex w16sdtdh wp14">
+<w:ftr xmlns:wpc="http://schemas.microsoft.com/office/word/2010/wordprocessingCanvas" xmlns:cx="http://schemas.microsoft.com/office/drawing/2014/chartex" xmlns:cx1="http://schemas.microsoft.com/office/drawing/2015/9/8/chartex" xmlns:cx2="http://schemas.microsoft.com/office/drawing/2015/10/21/chartex" xmlns:cx3="http://schemas.microsoft.com/office/drawing/2016/5/9/chartex" xmlns:cx4="http://schemas.microsoft.com/office/drawing/2016/5/10/chartex" xmlns:cx5="http://schemas.microsoft.com/office/drawing/2016/5/11/chartex" xmlns:cx6="http://schemas.microsoft.com/office/drawing/2016/5/12/chartex" xmlns:cx7="http://schemas.microsoft.com/office/drawing/2016/5/13/chartex" xmlns:cx8="http://schemas.microsoft.com/office/drawing/2016/5/14/chartex" xmlns:mc="http://schemas.openxmlformats.org/markup-compatibility/2006" xmlns:aink="http://schemas.microsoft.com/office/drawing/2016/ink" xmlns:am3d="http://schemas.microsoft.com/office/drawing/2017/model3d" xmlns:o="urn:schemas-microsoft-com:office:office" xmlns:oel="http://schemas.microsoft.com/office/2019/extlst" xmlns:r="http://schemas.openxmlformats.org/officeDocument/2006/relationships" xmlns:m="http://schemas.openxmlformats.org/officeDocument/2006/math" xmlns:v="urn:schemas-microsoft-com:vml" xmlns:wp14="http://schemas.microsoft.com/office/word/2010/wordprocessingDrawing" xmlns:wp="http://schemas.openxmlformats.org/drawingml/2006/wordprocessingDrawing" xmlns:w10="urn:schemas-microsoft-com:office:word" xmlns:w="http://schemas.openxmlformats.org/wordprocessingml/2006/main" xmlns:w14="http://schemas.microsoft.com/office/word/2010/wordml" xmlns:w15="http://schemas.microsoft.com/office/word/2012/wordml" xmlns:w16cex="http://schemas.microsoft.com/office/word/2018/wordml/cex" xmlns:w16cid="http://schemas.microsoft.com/office/word/2016/wordml/cid" xmlns:w16="http://schemas.microsoft.com/office/word/2018/wordml" xmlns:w16du="http://schemas.microsoft.com/office/word/2023/wordml/word16du" xmlns:w16sdtdh="http://schemas.microsoft.com/office/word/2020/wordml/sdtdatahash" xmlns:w16sdtfl="http://schemas.microsoft.com/office/word/2024/wordml/sdtformatlock" xmlns:w16se="http://schemas.microsoft.com/office/word/2015/wordml/symex" xmlns:wpg="http://schemas.microsoft.com/office/word/2010/wordprocessingGroup" xmlns:wpi="http://schemas.microsoft.com/office/word/2010/wordprocessingInk" xmlns:wne="http://schemas.microsoft.com/office/word/2006/wordml" xmlns:wps="http://schemas.microsoft.com/office/word/2010/wordprocessingShape" mc:Ignorable="w14 w15 w16se w16cid w16 w16cex w16sdtdh w16sdtfl w16du wp14">
   <w:p>
     <w:pPr>
       <w:pStyle w:val="Corpodetexto"/>
@@ -2955,14 +2936,12 @@
                   </w:rPr>
                   <w:t xml:space="preserve"> </w:t>
                 </w:r>
-                <w:proofErr w:type="spellStart"/>
                 <w:r>
                   <w:rPr>
                     <w:color w:val="FFFFFF"/>
                   </w:rPr>
                   <w:t>Stack</w:t>
                 </w:r>
-                <w:proofErr w:type="spellEnd"/>
                 <w:r>
                   <w:rPr>
                     <w:color w:val="FFFFFF"/>
@@ -2982,7 +2961,7 @@
 </file>
 
 <file path=word/footnotes.xml><?xml version="1.0" encoding="utf-8"?>
-<w:footnotes xmlns:wpc="http://schemas.microsoft.com/office/word/2010/wordprocessingCanvas" xmlns:cx="http://schemas.microsoft.com/office/drawing/2014/chartex" xmlns:cx1="http://schemas.microsoft.com/office/drawing/2015/9/8/chartex" xmlns:cx2="http://schemas.microsoft.com/office/drawing/2015/10/21/chartex" xmlns:cx3="http://schemas.microsoft.com/office/drawing/2016/5/9/chartex" xmlns:cx4="http://schemas.microsoft.com/office/drawing/2016/5/10/chartex" xmlns:cx5="http://schemas.microsoft.com/office/drawing/2016/5/11/chartex" xmlns:cx6="http://schemas.microsoft.com/office/drawing/2016/5/12/chartex" xmlns:cx7="http://schemas.microsoft.com/office/drawing/2016/5/13/chartex" xmlns:cx8="http://schemas.microsoft.com/office/drawing/2016/5/14/chartex" xmlns:mc="http://schemas.openxmlformats.org/markup-compatibility/2006" xmlns:aink="http://schemas.microsoft.com/office/drawing/2016/ink" xmlns:am3d="http://schemas.microsoft.com/office/drawing/2017/model3d" xmlns:o="urn:schemas-microsoft-com:office:office" xmlns:oel="http://schemas.microsoft.com/office/2019/extlst" xmlns:r="http://schemas.openxmlformats.org/officeDocument/2006/relationships" xmlns:m="http://schemas.openxmlformats.org/officeDocument/2006/math" xmlns:v="urn:schemas-microsoft-com:vml" xmlns:wp14="http://schemas.microsoft.com/office/word/2010/wordprocessingDrawing" xmlns:wp="http://schemas.openxmlformats.org/drawingml/2006/wordprocessingDrawing" xmlns:w10="urn:schemas-microsoft-com:office:word" xmlns:w="http://schemas.openxmlformats.org/wordprocessingml/2006/main" xmlns:w14="http://schemas.microsoft.com/office/word/2010/wordml" xmlns:w15="http://schemas.microsoft.com/office/word/2012/wordml" xmlns:w16cex="http://schemas.microsoft.com/office/word/2018/wordml/cex" xmlns:w16cid="http://schemas.microsoft.com/office/word/2016/wordml/cid" xmlns:w16="http://schemas.microsoft.com/office/word/2018/wordml" xmlns:w16sdtdh="http://schemas.microsoft.com/office/word/2020/wordml/sdtdatahash" xmlns:w16se="http://schemas.microsoft.com/office/word/2015/wordml/symex" xmlns:wpg="http://schemas.microsoft.com/office/word/2010/wordprocessingGroup" xmlns:wpi="http://schemas.microsoft.com/office/word/2010/wordprocessingInk" xmlns:wne="http://schemas.microsoft.com/office/word/2006/wordml" xmlns:wps="http://schemas.microsoft.com/office/word/2010/wordprocessingShape" mc:Ignorable="w14 w15 w16se w16cid w16 w16cex w16sdtdh wp14">
+<w:footnotes xmlns:wpc="http://schemas.microsoft.com/office/word/2010/wordprocessingCanvas" xmlns:cx="http://schemas.microsoft.com/office/drawing/2014/chartex" xmlns:cx1="http://schemas.microsoft.com/office/drawing/2015/9/8/chartex" xmlns:cx2="http://schemas.microsoft.com/office/drawing/2015/10/21/chartex" xmlns:cx3="http://schemas.microsoft.com/office/drawing/2016/5/9/chartex" xmlns:cx4="http://schemas.microsoft.com/office/drawing/2016/5/10/chartex" xmlns:cx5="http://schemas.microsoft.com/office/drawing/2016/5/11/chartex" xmlns:cx6="http://schemas.microsoft.com/office/drawing/2016/5/12/chartex" xmlns:cx7="http://schemas.microsoft.com/office/drawing/2016/5/13/chartex" xmlns:cx8="http://schemas.microsoft.com/office/drawing/2016/5/14/chartex" xmlns:mc="http://schemas.openxmlformats.org/markup-compatibility/2006" xmlns:aink="http://schemas.microsoft.com/office/drawing/2016/ink" xmlns:am3d="http://schemas.microsoft.com/office/drawing/2017/model3d" xmlns:o="urn:schemas-microsoft-com:office:office" xmlns:oel="http://schemas.microsoft.com/office/2019/extlst" xmlns:r="http://schemas.openxmlformats.org/officeDocument/2006/relationships" xmlns:m="http://schemas.openxmlformats.org/officeDocument/2006/math" xmlns:v="urn:schemas-microsoft-com:vml" xmlns:wp14="http://schemas.microsoft.com/office/word/2010/wordprocessingDrawing" xmlns:wp="http://schemas.openxmlformats.org/drawingml/2006/wordprocessingDrawing" xmlns:w10="urn:schemas-microsoft-com:office:word" xmlns:w="http://schemas.openxmlformats.org/wordprocessingml/2006/main" xmlns:w14="http://schemas.microsoft.com/office/word/2010/wordml" xmlns:w15="http://schemas.microsoft.com/office/word/2012/wordml" xmlns:w16cex="http://schemas.microsoft.com/office/word/2018/wordml/cex" xmlns:w16cid="http://schemas.microsoft.com/office/word/2016/wordml/cid" xmlns:w16="http://schemas.microsoft.com/office/word/2018/wordml" xmlns:w16du="http://schemas.microsoft.com/office/word/2023/wordml/word16du" xmlns:w16sdtdh="http://schemas.microsoft.com/office/word/2020/wordml/sdtdatahash" xmlns:w16sdtfl="http://schemas.microsoft.com/office/word/2024/wordml/sdtformatlock" xmlns:w16se="http://schemas.microsoft.com/office/word/2015/wordml/symex" xmlns:wpg="http://schemas.microsoft.com/office/word/2010/wordprocessingGroup" xmlns:wpi="http://schemas.microsoft.com/office/word/2010/wordprocessingInk" xmlns:wne="http://schemas.microsoft.com/office/word/2006/wordml" xmlns:wps="http://schemas.microsoft.com/office/word/2010/wordprocessingShape" mc:Ignorable="w14 w15 w16se w16cid w16 w16cex w16sdtdh w16sdtfl w16du wp14">
   <w:footnote w:type="separator" w:id="-1">
     <w:p>
       <w:r>
@@ -3001,7 +2980,7 @@
 </file>
 
 <file path=word/header1.xml><?xml version="1.0" encoding="utf-8"?>
-<w:hdr xmlns:wpc="http://schemas.microsoft.com/office/word/2010/wordprocessingCanvas" xmlns:cx="http://schemas.microsoft.com/office/drawing/2014/chartex" xmlns:cx1="http://schemas.microsoft.com/office/drawing/2015/9/8/chartex" xmlns:cx2="http://schemas.microsoft.com/office/drawing/2015/10/21/chartex" xmlns:cx3="http://schemas.microsoft.com/office/drawing/2016/5/9/chartex" xmlns:cx4="http://schemas.microsoft.com/office/drawing/2016/5/10/chartex" xmlns:cx5="http://schemas.microsoft.com/office/drawing/2016/5/11/chartex" xmlns:cx6="http://schemas.microsoft.com/office/drawing/2016/5/12/chartex" xmlns:cx7="http://schemas.microsoft.com/office/drawing/2016/5/13/chartex" xmlns:cx8="http://schemas.microsoft.com/office/drawing/2016/5/14/chartex" xmlns:mc="http://schemas.openxmlformats.org/markup-compatibility/2006" xmlns:aink="http://schemas.microsoft.com/office/drawing/2016/ink" xmlns:am3d="http://schemas.microsoft.com/office/drawing/2017/model3d" xmlns:o="urn:schemas-microsoft-com:office:office" xmlns:oel="http://schemas.microsoft.com/office/2019/extlst" xmlns:r="http://schemas.openxmlformats.org/officeDocument/2006/relationships" xmlns:m="http://schemas.openxmlformats.org/officeDocument/2006/math" xmlns:v="urn:schemas-microsoft-com:vml" xmlns:wp14="http://schemas.microsoft.com/office/word/2010/wordprocessingDrawing" xmlns:wp="http://schemas.openxmlformats.org/drawingml/2006/wordprocessingDrawing" xmlns:w10="urn:schemas-microsoft-com:office:word" xmlns:w="http://schemas.openxmlformats.org/wordprocessingml/2006/main" xmlns:w14="http://schemas.microsoft.com/office/word/2010/wordml" xmlns:w15="http://schemas.microsoft.com/office/word/2012/wordml" xmlns:w16cex="http://schemas.microsoft.com/office/word/2018/wordml/cex" xmlns:w16cid="http://schemas.microsoft.com/office/word/2016/wordml/cid" xmlns:w16="http://schemas.microsoft.com/office/word/2018/wordml" xmlns:w16sdtdh="http://schemas.microsoft.com/office/word/2020/wordml/sdtdatahash" xmlns:w16se="http://schemas.microsoft.com/office/word/2015/wordml/symex" xmlns:wpg="http://schemas.microsoft.com/office/word/2010/wordprocessingGroup" xmlns:wpi="http://schemas.microsoft.com/office/word/2010/wordprocessingInk" xmlns:wne="http://schemas.microsoft.com/office/word/2006/wordml" xmlns:wps="http://schemas.microsoft.com/office/word/2010/wordprocessingShape" mc:Ignorable="w14 w15 w16se w16cid w16 w16cex w16sdtdh wp14">
+<w:hdr xmlns:wpc="http://schemas.microsoft.com/office/word/2010/wordprocessingCanvas" xmlns:cx="http://schemas.microsoft.com/office/drawing/2014/chartex" xmlns:cx1="http://schemas.microsoft.com/office/drawing/2015/9/8/chartex" xmlns:cx2="http://schemas.microsoft.com/office/drawing/2015/10/21/chartex" xmlns:cx3="http://schemas.microsoft.com/office/drawing/2016/5/9/chartex" xmlns:cx4="http://schemas.microsoft.com/office/drawing/2016/5/10/chartex" xmlns:cx5="http://schemas.microsoft.com/office/drawing/2016/5/11/chartex" xmlns:cx6="http://schemas.microsoft.com/office/drawing/2016/5/12/chartex" xmlns:cx7="http://schemas.microsoft.com/office/drawing/2016/5/13/chartex" xmlns:cx8="http://schemas.microsoft.com/office/drawing/2016/5/14/chartex" xmlns:mc="http://schemas.openxmlformats.org/markup-compatibility/2006" xmlns:aink="http://schemas.microsoft.com/office/drawing/2016/ink" xmlns:am3d="http://schemas.microsoft.com/office/drawing/2017/model3d" xmlns:o="urn:schemas-microsoft-com:office:office" xmlns:oel="http://schemas.microsoft.com/office/2019/extlst" xmlns:r="http://schemas.openxmlformats.org/officeDocument/2006/relationships" xmlns:m="http://schemas.openxmlformats.org/officeDocument/2006/math" xmlns:v="urn:schemas-microsoft-com:vml" xmlns:wp14="http://schemas.microsoft.com/office/word/2010/wordprocessingDrawing" xmlns:wp="http://schemas.openxmlformats.org/drawingml/2006/wordprocessingDrawing" xmlns:w10="urn:schemas-microsoft-com:office:word" xmlns:w="http://schemas.openxmlformats.org/wordprocessingml/2006/main" xmlns:w14="http://schemas.microsoft.com/office/word/2010/wordml" xmlns:w15="http://schemas.microsoft.com/office/word/2012/wordml" xmlns:w16cex="http://schemas.microsoft.com/office/word/2018/wordml/cex" xmlns:w16cid="http://schemas.microsoft.com/office/word/2016/wordml/cid" xmlns:w16="http://schemas.microsoft.com/office/word/2018/wordml" xmlns:w16du="http://schemas.microsoft.com/office/word/2023/wordml/word16du" xmlns:w16sdtdh="http://schemas.microsoft.com/office/word/2020/wordml/sdtdatahash" xmlns:w16sdtfl="http://schemas.microsoft.com/office/word/2024/wordml/sdtformatlock" xmlns:w16se="http://schemas.microsoft.com/office/word/2015/wordml/symex" xmlns:wpg="http://schemas.microsoft.com/office/word/2010/wordprocessingGroup" xmlns:wpi="http://schemas.microsoft.com/office/word/2010/wordprocessingInk" xmlns:wne="http://schemas.microsoft.com/office/word/2006/wordml" xmlns:wps="http://schemas.microsoft.com/office/word/2010/wordprocessingShape" mc:Ignorable="w14 w15 w16se w16cid w16 w16cex w16sdtdh w16sdtfl w16du wp14">
   <w:p>
     <w:pPr>
       <w:pStyle w:val="Corpodetexto"/>
@@ -3024,7 +3003,7 @@
 </file>
 
 <file path=word/numbering.xml><?xml version="1.0" encoding="utf-8"?>
-<w:numbering xmlns:wpc="http://schemas.microsoft.com/office/word/2010/wordprocessingCanvas" xmlns:cx="http://schemas.microsoft.com/office/drawing/2014/chartex" xmlns:cx1="http://schemas.microsoft.com/office/drawing/2015/9/8/chartex" xmlns:cx2="http://schemas.microsoft.com/office/drawing/2015/10/21/chartex" xmlns:cx3="http://schemas.microsoft.com/office/drawing/2016/5/9/chartex" xmlns:cx4="http://schemas.microsoft.com/office/drawing/2016/5/10/chartex" xmlns:cx5="http://schemas.microsoft.com/office/drawing/2016/5/11/chartex" xmlns:cx6="http://schemas.microsoft.com/office/drawing/2016/5/12/chartex" xmlns:cx7="http://schemas.microsoft.com/office/drawing/2016/5/13/chartex" xmlns:cx8="http://schemas.microsoft.com/office/drawing/2016/5/14/chartex" xmlns:mc="http://schemas.openxmlformats.org/markup-compatibility/2006" xmlns:aink="http://schemas.microsoft.com/office/drawing/2016/ink" xmlns:am3d="http://schemas.microsoft.com/office/drawing/2017/model3d" xmlns:o="urn:schemas-microsoft-com:office:office" xmlns:oel="http://schemas.microsoft.com/office/2019/extlst" xmlns:r="http://schemas.openxmlformats.org/officeDocument/2006/relationships" xmlns:m="http://schemas.openxmlformats.org/officeDocument/2006/math" xmlns:v="urn:schemas-microsoft-com:vml" xmlns:wp14="http://schemas.microsoft.com/office/word/2010/wordprocessingDrawing" xmlns:wp="http://schemas.openxmlformats.org/drawingml/2006/wordprocessingDrawing" xmlns:w10="urn:schemas-microsoft-com:office:word" xmlns:w="http://schemas.openxmlformats.org/wordprocessingml/2006/main" xmlns:w14="http://schemas.microsoft.com/office/word/2010/wordml" xmlns:w15="http://schemas.microsoft.com/office/word/2012/wordml" xmlns:w16cex="http://schemas.microsoft.com/office/word/2018/wordml/cex" xmlns:w16cid="http://schemas.microsoft.com/office/word/2016/wordml/cid" xmlns:w16="http://schemas.microsoft.com/office/word/2018/wordml" xmlns:w16sdtdh="http://schemas.microsoft.com/office/word/2020/wordml/sdtdatahash" xmlns:w16se="http://schemas.microsoft.com/office/word/2015/wordml/symex" xmlns:wpg="http://schemas.microsoft.com/office/word/2010/wordprocessingGroup" xmlns:wpi="http://schemas.microsoft.com/office/word/2010/wordprocessingInk" xmlns:wne="http://schemas.microsoft.com/office/word/2006/wordml" xmlns:wps="http://schemas.microsoft.com/office/word/2010/wordprocessingShape" mc:Ignorable="w14 w15 w16se w16cid w16 w16cex w16sdtdh wp14">
+<w:numbering xmlns:wpc="http://schemas.microsoft.com/office/word/2010/wordprocessingCanvas" xmlns:cx="http://schemas.microsoft.com/office/drawing/2014/chartex" xmlns:cx1="http://schemas.microsoft.com/office/drawing/2015/9/8/chartex" xmlns:cx2="http://schemas.microsoft.com/office/drawing/2015/10/21/chartex" xmlns:cx3="http://schemas.microsoft.com/office/drawing/2016/5/9/chartex" xmlns:cx4="http://schemas.microsoft.com/office/drawing/2016/5/10/chartex" xmlns:cx5="http://schemas.microsoft.com/office/drawing/2016/5/11/chartex" xmlns:cx6="http://schemas.microsoft.com/office/drawing/2016/5/12/chartex" xmlns:cx7="http://schemas.microsoft.com/office/drawing/2016/5/13/chartex" xmlns:cx8="http://schemas.microsoft.com/office/drawing/2016/5/14/chartex" xmlns:mc="http://schemas.openxmlformats.org/markup-compatibility/2006" xmlns:aink="http://schemas.microsoft.com/office/drawing/2016/ink" xmlns:am3d="http://schemas.microsoft.com/office/drawing/2017/model3d" xmlns:o="urn:schemas-microsoft-com:office:office" xmlns:oel="http://schemas.microsoft.com/office/2019/extlst" xmlns:r="http://schemas.openxmlformats.org/officeDocument/2006/relationships" xmlns:m="http://schemas.openxmlformats.org/officeDocument/2006/math" xmlns:v="urn:schemas-microsoft-com:vml" xmlns:wp14="http://schemas.microsoft.com/office/word/2010/wordprocessingDrawing" xmlns:wp="http://schemas.openxmlformats.org/drawingml/2006/wordprocessingDrawing" xmlns:w10="urn:schemas-microsoft-com:office:word" xmlns:w="http://schemas.openxmlformats.org/wordprocessingml/2006/main" xmlns:w14="http://schemas.microsoft.com/office/word/2010/wordml" xmlns:w15="http://schemas.microsoft.com/office/word/2012/wordml" xmlns:w16cex="http://schemas.microsoft.com/office/word/2018/wordml/cex" xmlns:w16cid="http://schemas.microsoft.com/office/word/2016/wordml/cid" xmlns:w16="http://schemas.microsoft.com/office/word/2018/wordml" xmlns:w16du="http://schemas.microsoft.com/office/word/2023/wordml/word16du" xmlns:w16sdtdh="http://schemas.microsoft.com/office/word/2020/wordml/sdtdatahash" xmlns:w16sdtfl="http://schemas.microsoft.com/office/word/2024/wordml/sdtformatlock" xmlns:w16se="http://schemas.microsoft.com/office/word/2015/wordml/symex" xmlns:wpg="http://schemas.microsoft.com/office/word/2010/wordprocessingGroup" xmlns:wpi="http://schemas.microsoft.com/office/word/2010/wordprocessingInk" xmlns:wne="http://schemas.microsoft.com/office/word/2006/wordml" xmlns:wps="http://schemas.microsoft.com/office/word/2010/wordprocessingShape" mc:Ignorable="w14 w15 w16se w16cid w16 w16cex w16sdtdh w16sdtfl w16du wp14">
   <w:abstractNum w:abstractNumId="0" w15:restartNumberingAfterBreak="0">
     <w:nsid w:val="010133FD"/>
     <w:multiLevelType w:val="hybridMultilevel"/>
@@ -5403,7 +5382,7 @@
 </file>
 
 <file path=word/styles.xml><?xml version="1.0" encoding="utf-8"?>
-<w:styles xmlns:mc="http://schemas.openxmlformats.org/markup-compatibility/2006" xmlns:r="http://schemas.openxmlformats.org/officeDocument/2006/relationships" xmlns:w="http://schemas.openxmlformats.org/wordprocessingml/2006/main" xmlns:w14="http://schemas.microsoft.com/office/word/2010/wordml" xmlns:w15="http://schemas.microsoft.com/office/word/2012/wordml" xmlns:w16cex="http://schemas.microsoft.com/office/word/2018/wordml/cex" xmlns:w16cid="http://schemas.microsoft.com/office/word/2016/wordml/cid" xmlns:w16="http://schemas.microsoft.com/office/word/2018/wordml" xmlns:w16sdtdh="http://schemas.microsoft.com/office/word/2020/wordml/sdtdatahash" xmlns:w16se="http://schemas.microsoft.com/office/word/2015/wordml/symex" mc:Ignorable="w14 w15 w16se w16cid w16 w16cex w16sdtdh">
+<w:styles xmlns:mc="http://schemas.openxmlformats.org/markup-compatibility/2006" xmlns:r="http://schemas.openxmlformats.org/officeDocument/2006/relationships" xmlns:w="http://schemas.openxmlformats.org/wordprocessingml/2006/main" xmlns:w14="http://schemas.microsoft.com/office/word/2010/wordml" xmlns:w15="http://schemas.microsoft.com/office/word/2012/wordml" xmlns:w16cex="http://schemas.microsoft.com/office/word/2018/wordml/cex" xmlns:w16cid="http://schemas.microsoft.com/office/word/2016/wordml/cid" xmlns:w16="http://schemas.microsoft.com/office/word/2018/wordml" xmlns:w16du="http://schemas.microsoft.com/office/word/2023/wordml/word16du" xmlns:w16sdtdh="http://schemas.microsoft.com/office/word/2020/wordml/sdtdatahash" xmlns:w16sdtfl="http://schemas.microsoft.com/office/word/2024/wordml/sdtformatlock" xmlns:w16se="http://schemas.microsoft.com/office/word/2015/wordml/symex" mc:Ignorable="w14 w15 w16se w16cid w16 w16cex w16sdtdh w16sdtfl w16du">
   <w:docDefaults>
     <w:rPrDefault>
       <w:rPr>

</xml_diff>